<commit_message>
DSA-Notes: deep review, gap-fill & enrichment across all 26 modules (print-ready)
Add-only enrichment (~4,400 new lines) to every module M01-M26; no existing
content removed or reworded. For each topic: added missing concepts, related
subtopics, worked dry-run traces, pseudocode + complexity, pitfalls, and new
MCQs / flash cards. Rebuilt all 31 .docx from the markdown source via pandoc.

Visuals: 10 new house-style diagrams (matplotlib helper viz_style.py):
146 heap-array-indexing, 150 rotation-reversal, 170 clone-random,
171 consistent-hashing, 190 avl-four-rotations, 191 bst-delete,
210 dijkstra-trace, 211 dsu-compression, 250 reroot-dp, 290 sqrt-decomposition.

Verified: every original line preserved verbatim; all 155 image refs resolve;
each .docx embeds exactly its referenced images.
</commit_message>
<xml_diff>
--- a/SITP/DSA-Notes/M02_Arrays.docx
+++ b/SITP/DSA-Notes/M02_Arrays.docx
@@ -60,7 +60,7 @@
         </w:p>
       </w:sdtContent>
     </w:sdt>
-    <w:bookmarkStart w:id="150" w:name="module-2-arrays"/>
+    <w:bookmarkStart w:id="159" w:name="module-2-arrays"/>
     <w:p>
       <w:pPr>
         <w:pStyle w:val="Heading1"/>
@@ -10983,15 +10983,358 @@
     </w:p>
     <w:bookmarkEnd w:id="143"/>
     <w:bookmarkEnd w:id="144"/>
-    <w:bookmarkStart w:id="145" w:name="module-2-concept-review-one-page"/>
+    <w:bookmarkStart w:id="153" w:name="more-must-know-array-techniques"/>
     <w:p>
       <w:pPr>
         <w:pStyle w:val="Heading2"/>
       </w:pPr>
       <w:r>
-        <w:t xml:space="preserve">Module 2 — Concept Review (one page)</w:t>
-      </w:r>
-    </w:p>
+        <w:t xml:space="preserve">2.10 More Must-Know Array Techniques</w:t>
+      </w:r>
+    </w:p>
+    <w:p>
+      <w:pPr>
+        <w:pStyle w:val="FirstParagraph"/>
+      </w:pPr>
+      <w:r>
+        <w:t xml:space="preserve">A few more patterns that appear again and again in interviews and GATE. Each has</w:t>
+      </w:r>
+      <w:r>
+        <w:t xml:space="preserve"> </w:t>
+      </w:r>
+      <w:r>
+        <w:t xml:space="preserve">a small, memorable trick.</w:t>
+      </w:r>
+    </w:p>
+    <w:bookmarkStart w:id="145" w:name="Xc7a27fb9531299ad7961faf3aa5e46b1449cdd6"/>
+    <w:p>
+      <w:pPr>
+        <w:pStyle w:val="Heading3"/>
+      </w:pPr>
+      <w:r>
+        <w:t xml:space="preserve">0) Subarray vs Subsequence vs Subset (clear this up first!)</w:t>
+      </w:r>
+    </w:p>
+    <w:p>
+      <w:pPr>
+        <w:pStyle w:val="FirstParagraph"/>
+      </w:pPr>
+      <w:r>
+        <w:t xml:space="preserve">Interviewers deliberately test whether you know these apart:</w:t>
+      </w:r>
+    </w:p>
+    <w:tbl>
+      <w:tblPr>
+        <w:tblStyle w:val="Table"/>
+        <w:tblW w:type="pct" w:w="5000"/>
+        <w:tblLayout w:type="fixed"/>
+        <w:tblLook w:firstRow="1" w:lastRow="0" w:firstColumn="0" w:lastColumn="0" w:noHBand="0" w:noVBand="0" w:val="0020"/>
+      </w:tblPr>
+      <w:tblGrid>
+        <w:gridCol w:w="1819"/>
+        <w:gridCol w:w="1391"/>
+        <w:gridCol w:w="1391"/>
+        <w:gridCol w:w="3317"/>
+      </w:tblGrid>
+      <w:tr>
+        <w:trPr>
+          <w:tblHeader w:val="on"/>
+        </w:trPr>
+        <w:tc>
+          <w:tcPr/>
+          <w:p>
+            <w:pPr>
+              <w:pStyle w:val="Compact"/>
+            </w:pPr>
+            <w:r>
+              <w:t xml:space="preserve">Term</w:t>
+            </w:r>
+          </w:p>
+        </w:tc>
+        <w:tc>
+          <w:tcPr/>
+          <w:p>
+            <w:pPr>
+              <w:pStyle w:val="Compact"/>
+            </w:pPr>
+            <w:r>
+              <w:t xml:space="preserve">Contiguous?</w:t>
+            </w:r>
+          </w:p>
+        </w:tc>
+        <w:tc>
+          <w:tcPr/>
+          <w:p>
+            <w:pPr>
+              <w:pStyle w:val="Compact"/>
+            </w:pPr>
+            <w:r>
+              <w:t xml:space="preserve">Order kept?</w:t>
+            </w:r>
+          </w:p>
+        </w:tc>
+        <w:tc>
+          <w:tcPr/>
+          <w:p>
+            <w:pPr>
+              <w:pStyle w:val="Compact"/>
+            </w:pPr>
+            <w:r>
+              <w:t xml:space="preserve">Example from</w:t>
+            </w:r>
+            <w:r>
+              <w:t xml:space="preserve"> </w:t>
+            </w:r>
+            <w:r>
+              <w:rPr>
+                <w:rStyle w:val="VerbatimChar"/>
+              </w:rPr>
+              <w:t xml:space="preserve">[1,2,3]</w:t>
+            </w:r>
+          </w:p>
+        </w:tc>
+      </w:tr>
+      <w:tr>
+        <w:tc>
+          <w:tcPr/>
+          <w:p>
+            <w:pPr>
+              <w:pStyle w:val="Compact"/>
+            </w:pPr>
+            <w:r>
+              <w:rPr>
+                <w:b/>
+                <w:bCs/>
+              </w:rPr>
+              <w:t xml:space="preserve">Subarray</w:t>
+            </w:r>
+          </w:p>
+        </w:tc>
+        <w:tc>
+          <w:tcPr/>
+          <w:p>
+            <w:pPr>
+              <w:pStyle w:val="Compact"/>
+            </w:pPr>
+            <w:r>
+              <w:rPr>
+                <w:b/>
+                <w:bCs/>
+              </w:rPr>
+              <w:t xml:space="preserve">Yes</w:t>
+            </w:r>
+          </w:p>
+        </w:tc>
+        <w:tc>
+          <w:tcPr/>
+          <w:p>
+            <w:pPr>
+              <w:pStyle w:val="Compact"/>
+            </w:pPr>
+            <w:r>
+              <w:t xml:space="preserve">Yes</w:t>
+            </w:r>
+          </w:p>
+        </w:tc>
+        <w:tc>
+          <w:tcPr/>
+          <w:p>
+            <w:pPr>
+              <w:pStyle w:val="Compact"/>
+            </w:pPr>
+            <w:r>
+              <w:rPr>
+                <w:rStyle w:val="VerbatimChar"/>
+              </w:rPr>
+              <w:t xml:space="preserve">[2,3]</w:t>
+            </w:r>
+            <w:r>
+              <w:t xml:space="preserve"> </w:t>
+            </w:r>
+            <w:r>
+              <w:t xml:space="preserve">(a slice) — not</w:t>
+            </w:r>
+            <w:r>
+              <w:t xml:space="preserve"> </w:t>
+            </w:r>
+            <w:r>
+              <w:rPr>
+                <w:rStyle w:val="VerbatimChar"/>
+              </w:rPr>
+              <w:t xml:space="preserve">[1,3]</w:t>
+            </w:r>
+          </w:p>
+        </w:tc>
+      </w:tr>
+      <w:tr>
+        <w:tc>
+          <w:tcPr/>
+          <w:p>
+            <w:pPr>
+              <w:pStyle w:val="Compact"/>
+            </w:pPr>
+            <w:r>
+              <w:rPr>
+                <w:b/>
+                <w:bCs/>
+              </w:rPr>
+              <w:t xml:space="preserve">Substring</w:t>
+            </w:r>
+          </w:p>
+        </w:tc>
+        <w:tc>
+          <w:tcPr/>
+          <w:p>
+            <w:pPr>
+              <w:pStyle w:val="Compact"/>
+            </w:pPr>
+            <w:r>
+              <w:t xml:space="preserve">Yes</w:t>
+            </w:r>
+          </w:p>
+        </w:tc>
+        <w:tc>
+          <w:tcPr/>
+          <w:p>
+            <w:pPr>
+              <w:pStyle w:val="Compact"/>
+            </w:pPr>
+            <w:r>
+              <w:t xml:space="preserve">Yes</w:t>
+            </w:r>
+          </w:p>
+        </w:tc>
+        <w:tc>
+          <w:tcPr/>
+          <w:p>
+            <w:pPr>
+              <w:pStyle w:val="Compact"/>
+            </w:pPr>
+            <w:r>
+              <w:t xml:space="preserve">(same idea, for strings)</w:t>
+            </w:r>
+          </w:p>
+        </w:tc>
+      </w:tr>
+      <w:tr>
+        <w:tc>
+          <w:tcPr/>
+          <w:p>
+            <w:pPr>
+              <w:pStyle w:val="Compact"/>
+            </w:pPr>
+            <w:r>
+              <w:rPr>
+                <w:b/>
+                <w:bCs/>
+              </w:rPr>
+              <w:t xml:space="preserve">Subsequence</w:t>
+            </w:r>
+          </w:p>
+        </w:tc>
+        <w:tc>
+          <w:tcPr/>
+          <w:p>
+            <w:pPr>
+              <w:pStyle w:val="Compact"/>
+            </w:pPr>
+            <w:r>
+              <w:t xml:space="preserve">No</w:t>
+            </w:r>
+          </w:p>
+        </w:tc>
+        <w:tc>
+          <w:tcPr/>
+          <w:p>
+            <w:pPr>
+              <w:pStyle w:val="Compact"/>
+            </w:pPr>
+            <w:r>
+              <w:t xml:space="preserve">Yes</w:t>
+            </w:r>
+          </w:p>
+        </w:tc>
+        <w:tc>
+          <w:tcPr/>
+          <w:p>
+            <w:pPr>
+              <w:pStyle w:val="Compact"/>
+            </w:pPr>
+            <w:r>
+              <w:rPr>
+                <w:rStyle w:val="VerbatimChar"/>
+              </w:rPr>
+              <w:t xml:space="preserve">[1,3]</w:t>
+            </w:r>
+            <w:r>
+              <w:t xml:space="preserve"> </w:t>
+            </w:r>
+            <w:r>
+              <w:t xml:space="preserve">(drop the middle) ✓</w:t>
+            </w:r>
+          </w:p>
+        </w:tc>
+      </w:tr>
+      <w:tr>
+        <w:tc>
+          <w:tcPr/>
+          <w:p>
+            <w:pPr>
+              <w:pStyle w:val="Compact"/>
+            </w:pPr>
+            <w:r>
+              <w:rPr>
+                <w:b/>
+                <w:bCs/>
+              </w:rPr>
+              <w:t xml:space="preserve">Subset</w:t>
+            </w:r>
+          </w:p>
+        </w:tc>
+        <w:tc>
+          <w:tcPr/>
+          <w:p>
+            <w:pPr>
+              <w:pStyle w:val="Compact"/>
+            </w:pPr>
+            <w:r>
+              <w:t xml:space="preserve">No</w:t>
+            </w:r>
+          </w:p>
+        </w:tc>
+        <w:tc>
+          <w:tcPr/>
+          <w:p>
+            <w:pPr>
+              <w:pStyle w:val="Compact"/>
+            </w:pPr>
+            <w:r>
+              <w:t xml:space="preserve">No (a set)</w:t>
+            </w:r>
+          </w:p>
+        </w:tc>
+        <w:tc>
+          <w:tcPr/>
+          <w:p>
+            <w:pPr>
+              <w:pStyle w:val="Compact"/>
+            </w:pPr>
+            <w:r>
+              <w:rPr>
+                <w:rStyle w:val="VerbatimChar"/>
+              </w:rPr>
+              <w:t xml:space="preserve">{3,1}</w:t>
+            </w:r>
+            <w:r>
+              <w:t xml:space="preserve"> </w:t>
+            </w:r>
+            <w:r>
+              <w:t xml:space="preserve">— order doesn’t matter</w:t>
+            </w:r>
+          </w:p>
+        </w:tc>
+      </w:tr>
+    </w:tbl>
     <w:p>
       <w:pPr>
         <w:pStyle w:val="Compact"/>
@@ -11001,29 +11344,52 @@
         </w:numPr>
       </w:pPr>
       <w:r>
-        <w:rPr>
-          <w:b/>
-          <w:bCs/>
-        </w:rPr>
-        <w:t xml:space="preserve">Array</w:t>
-      </w:r>
-      <w:r>
-        <w:t xml:space="preserve"> </w:t>
-      </w:r>
-      <w:r>
-        <w:t xml:space="preserve">= contiguous block; access O(1) via</w:t>
-      </w:r>
-      <w:r>
-        <w:t xml:space="preserve"> </w:t>
-      </w:r>
-      <w:r>
-        <w:rPr>
-          <w:rStyle w:val="VerbatimChar"/>
-        </w:rPr>
-        <w:t xml:space="preserve">base + i*size</w:t>
-      </w:r>
-      <w:r>
-        <w:t xml:space="preserve">; cache-friendly.</w:t>
+        <w:t xml:space="preserve">An array of length</w:t>
+      </w:r>
+      <w:r>
+        <w:t xml:space="preserve"> </w:t>
+      </w:r>
+      <w:r>
+        <w:rPr>
+          <w:rStyle w:val="VerbatimChar"/>
+        </w:rPr>
+        <w:t xml:space="preserve">n</w:t>
+      </w:r>
+      <w:r>
+        <w:t xml:space="preserve"> </w:t>
+      </w:r>
+      <w:r>
+        <w:t xml:space="preserve">has</w:t>
+      </w:r>
+      <w:r>
+        <w:t xml:space="preserve"> </w:t>
+      </w:r>
+      <w:r>
+        <w:rPr>
+          <w:rStyle w:val="VerbatimChar"/>
+        </w:rPr>
+        <w:t xml:space="preserve">n(n+1)/2</w:t>
+      </w:r>
+      <w:r>
+        <w:t xml:space="preserve"> </w:t>
+      </w:r>
+      <w:r>
+        <w:t xml:space="preserve">subarrays, but</w:t>
+      </w:r>
+      <w:r>
+        <w:t xml:space="preserve"> </w:t>
+      </w:r>
+      <w:r>
+        <w:rPr>
+          <w:rStyle w:val="VerbatimChar"/>
+        </w:rPr>
+        <w:t xml:space="preserve">2ⁿ</w:t>
+      </w:r>
+      <w:r>
+        <w:t xml:space="preserve"> </w:t>
+      </w:r>
+      <w:r>
+        <w:t xml:space="preserve">subsequences/subsets.</w:t>
       </w:r>
     </w:p>
     <w:p>
@@ -11039,935 +11405,29 @@
           <w:b/>
           <w:bCs/>
         </w:rPr>
-        <w:t xml:space="preserve">Dynamic array</w:t>
-      </w:r>
-      <w:r>
-        <w:t xml:space="preserve"> </w:t>
-      </w:r>
-      <w:r>
-        <w:t xml:space="preserve">doubles when full → append O(1) amortised (proof:</w:t>
-      </w:r>
-      <w:r>
-        <w:t xml:space="preserve"> </w:t>
-      </w:r>
-      <w:r>
-        <w:t xml:space="preserve">1+2+4+…+n = O(n) total).</w:t>
-      </w:r>
-    </w:p>
-    <w:p>
-      <w:pPr>
-        <w:pStyle w:val="Compact"/>
-        <w:numPr>
-          <w:ilvl w:val="0"/>
-          <w:numId w:val="1045"/>
-        </w:numPr>
-      </w:pPr>
-      <w:r>
-        <w:rPr>
-          <w:b/>
-          <w:bCs/>
-        </w:rPr>
-        <w:t xml:space="preserve">Prefix sum</w:t>
-      </w:r>
-      <w:r>
-        <w:t xml:space="preserve"> </w:t>
-      </w:r>
-      <w:r>
-        <w:t xml:space="preserve">→ range</w:t>
-      </w:r>
-      <w:r>
-        <w:t xml:space="preserve"> </w:t>
-      </w:r>
-      <w:r>
-        <w:rPr>
-          <w:b/>
-          <w:bCs/>
-        </w:rPr>
-        <w:t xml:space="preserve">query</w:t>
-      </w:r>
-      <w:r>
-        <w:t xml:space="preserve"> </w:t>
-      </w:r>
-      <w:r>
-        <w:t xml:space="preserve">O(1) (1D &amp; 2D).</w:t>
-      </w:r>
-      <w:r>
-        <w:t xml:space="preserve"> </w:t>
-      </w:r>
-      <w:r>
-        <w:rPr>
-          <w:b/>
-          <w:bCs/>
-        </w:rPr>
-        <w:t xml:space="preserve">Difference array</w:t>
-      </w:r>
-      <w:r>
-        <w:t xml:space="preserve"> </w:t>
-      </w:r>
-      <w:r>
-        <w:t xml:space="preserve">→ range</w:t>
-      </w:r>
-      <w:r>
-        <w:t xml:space="preserve"> </w:t>
-      </w:r>
-      <w:r>
-        <w:rPr>
-          <w:b/>
-          <w:bCs/>
-        </w:rPr>
-        <w:t xml:space="preserve">update</w:t>
-      </w:r>
-      <w:r>
-        <w:t xml:space="preserve"> </w:t>
-      </w:r>
-      <w:r>
-        <w:t xml:space="preserve">O(1).</w:t>
-      </w:r>
-    </w:p>
-    <w:p>
-      <w:pPr>
-        <w:pStyle w:val="Compact"/>
-        <w:numPr>
-          <w:ilvl w:val="0"/>
-          <w:numId w:val="1045"/>
-        </w:numPr>
-      </w:pPr>
-      <w:r>
-        <w:rPr>
-          <w:b/>
-          <w:bCs/>
-        </w:rPr>
-        <w:t xml:space="preserve">Two pointers</w:t>
-      </w:r>
-      <w:r>
-        <w:t xml:space="preserve"> </w:t>
-      </w:r>
-      <w:r>
-        <w:t xml:space="preserve">→ O(n²)→O(n) on sorted/monotonic input (pair sum, palindrome,</w:t>
-      </w:r>
-      <w:r>
-        <w:t xml:space="preserve"> </w:t>
-      </w:r>
-      <w:r>
-        <w:t xml:space="preserve">3Sum).</w:t>
-      </w:r>
-    </w:p>
-    <w:p>
-      <w:pPr>
-        <w:pStyle w:val="Compact"/>
-        <w:numPr>
-          <w:ilvl w:val="0"/>
-          <w:numId w:val="1045"/>
-        </w:numPr>
-      </w:pPr>
-      <w:r>
-        <w:rPr>
-          <w:b/>
-          <w:bCs/>
-        </w:rPr>
-        <w:t xml:space="preserve">Sliding window</w:t>
-      </w:r>
-      <w:r>
-        <w:t xml:space="preserve"> </w:t>
-      </w:r>
-      <w:r>
-        <w:t xml:space="preserve">→ contiguous subarray/substring, O(n) (each element in/out</w:t>
-      </w:r>
-      <w:r>
-        <w:t xml:space="preserve"> </w:t>
-      </w:r>
-      <w:r>
-        <w:t xml:space="preserve">once); fixed vs variable.</w:t>
-      </w:r>
-    </w:p>
-    <w:p>
-      <w:pPr>
-        <w:pStyle w:val="Compact"/>
-        <w:numPr>
-          <w:ilvl w:val="0"/>
-          <w:numId w:val="1045"/>
-        </w:numPr>
-      </w:pPr>
-      <w:r>
-        <w:rPr>
-          <w:b/>
-          <w:bCs/>
-        </w:rPr>
-        <w:t xml:space="preserve">Kadane</w:t>
-      </w:r>
-      <w:r>
-        <w:t xml:space="preserve"> </w:t>
-      </w:r>
-      <w:r>
-        <w:t xml:space="preserve">→ max subarray O(n)/O(1); init</w:t>
-      </w:r>
-      <w:r>
-        <w:t xml:space="preserve"> </w:t>
-      </w:r>
-      <w:r>
-        <w:rPr>
-          <w:rStyle w:val="VerbatimChar"/>
-        </w:rPr>
-        <w:t xml:space="preserve">best=a[0]</w:t>
-      </w:r>
-      <w:r>
-        <w:t xml:space="preserve"> </w:t>
-      </w:r>
-      <w:r>
-        <w:t xml:space="preserve">(all-negative trap).</w:t>
-      </w:r>
-    </w:p>
-    <w:p>
-      <w:pPr>
-        <w:pStyle w:val="Compact"/>
-        <w:numPr>
-          <w:ilvl w:val="0"/>
-          <w:numId w:val="1045"/>
-        </w:numPr>
-      </w:pPr>
-      <w:r>
-        <w:rPr>
-          <w:b/>
-          <w:bCs/>
-        </w:rPr>
-        <w:t xml:space="preserve">Dutch flag</w:t>
-      </w:r>
-      <w:r>
-        <w:t xml:space="preserve"> </w:t>
-      </w:r>
-      <w:r>
-        <w:t xml:space="preserve">→ 3-way partition, one pass, O(1) space.</w:t>
-      </w:r>
-    </w:p>
-    <w:p>
-      <w:pPr>
-        <w:pStyle w:val="Compact"/>
-        <w:numPr>
-          <w:ilvl w:val="0"/>
-          <w:numId w:val="1045"/>
-        </w:numPr>
-      </w:pPr>
-      <w:r>
-        <w:rPr>
-          <w:b/>
-          <w:bCs/>
-        </w:rPr>
-        <w:t xml:space="preserve">Matrix</w:t>
-      </w:r>
-      <w:r>
-        <w:t xml:space="preserve"> </w:t>
-      </w:r>
-      <w:r>
-        <w:t xml:space="preserve">→ rotate = transpose+reverse; spiral; sorted search from a corner.</w:t>
-      </w:r>
-    </w:p>
-    <w:p>
-      <w:pPr>
-        <w:pStyle w:val="Compact"/>
-        <w:numPr>
-          <w:ilvl w:val="0"/>
-          <w:numId w:val="1045"/>
-        </w:numPr>
-      </w:pPr>
-      <w:r>
-        <w:rPr>
-          <w:b/>
-          <w:bCs/>
-        </w:rPr>
-        <w:t xml:space="preserve">Moore’s voting</w:t>
-      </w:r>
-      <w:r>
-        <w:t xml:space="preserve"> </w:t>
-      </w:r>
-      <w:r>
-        <w:t xml:space="preserve">→ majority (&gt;n/2) in O(n)/O(1) (tug of war).</w:t>
-      </w:r>
-    </w:p>
-    <w:p>
-      <w:pPr>
-        <w:pStyle w:val="Compact"/>
-        <w:numPr>
-          <w:ilvl w:val="0"/>
-          <w:numId w:val="1045"/>
-        </w:numPr>
-      </w:pPr>
-      <w:r>
-        <w:rPr>
-          <w:b/>
-          <w:bCs/>
-        </w:rPr>
-        <w:t xml:space="preserve">Merge intervals</w:t>
-      </w:r>
-      <w:r>
-        <w:t xml:space="preserve"> </w:t>
-      </w:r>
-      <w:r>
-        <w:t xml:space="preserve">→ sort by start, then sweep merging overlaps.</w:t>
-      </w:r>
-    </w:p>
-    <w:p>
-      <w:pPr>
-        <w:pStyle w:val="Compact"/>
-        <w:numPr>
-          <w:ilvl w:val="0"/>
-          <w:numId w:val="1045"/>
-        </w:numPr>
-      </w:pPr>
-      <w:r>
-        <w:rPr>
-          <w:b/>
-          <w:bCs/>
-        </w:rPr>
-        <w:t xml:space="preserve">Cyclic sort</w:t>
-      </w:r>
-      <w:r>
-        <w:t xml:space="preserve"> </w:t>
-      </w:r>
-      <w:r>
-        <w:t xml:space="preserve">→ values in 1..n → put each at index value−1 (find missing/dup).</w:t>
-      </w:r>
-    </w:p>
-    <w:bookmarkEnd w:id="145"/>
-    <w:bookmarkStart w:id="146" w:name="module-2-flash-cards"/>
-    <w:p>
-      <w:pPr>
-        <w:pStyle w:val="Heading2"/>
-      </w:pPr>
-      <w:r>
-        <w:t xml:space="preserve">Module 2 — Flash Cards</w:t>
-      </w:r>
-    </w:p>
-    <w:p>
-      <w:pPr>
-        <w:pStyle w:val="Compact"/>
-        <w:numPr>
-          <w:ilvl w:val="0"/>
-          <w:numId w:val="1046"/>
-        </w:numPr>
-      </w:pPr>
-      <w:r>
-        <w:t xml:space="preserve">Q: Append amortised cost &amp; why?</w:t>
-      </w:r>
-      <w:r>
-        <w:t xml:space="preserve"> </w:t>
-      </w:r>
-      <w:r>
-        <w:rPr>
-          <w:b/>
-          <w:bCs/>
-        </w:rPr>
-        <w:t xml:space="preserve">A: O(1); doubling → 1+2+…+n = 2n.</w:t>
-      </w:r>
-    </w:p>
-    <w:p>
-      <w:pPr>
-        <w:pStyle w:val="Compact"/>
-        <w:numPr>
-          <w:ilvl w:val="0"/>
-          <w:numId w:val="1046"/>
-        </w:numPr>
-      </w:pPr>
-      <w:r>
-        <w:t xml:space="preserve">Q: Range sum O(1)?</w:t>
-      </w:r>
-      <w:r>
-        <w:t xml:space="preserve"> </w:t>
-      </w:r>
-      <w:r>
-        <w:rPr>
-          <w:b/>
-          <w:bCs/>
-        </w:rPr>
-        <w:t xml:space="preserve">A: prefix sum,</w:t>
-      </w:r>
-      <w:r>
-        <w:rPr>
-          <w:b/>
-          <w:bCs/>
-        </w:rPr>
-        <w:t xml:space="preserve"> </w:t>
-      </w:r>
-      <w:r>
-        <w:rPr>
-          <w:rStyle w:val="VerbatimChar"/>
-          <w:b/>
-          <w:bCs/>
-        </w:rPr>
-        <w:t xml:space="preserve">pre[R+1]-pre[L]</w:t>
-      </w:r>
-      <w:r>
-        <w:rPr>
-          <w:b/>
-          <w:bCs/>
-        </w:rPr>
-        <w:t xml:space="preserve">.</w:t>
-      </w:r>
-    </w:p>
-    <w:p>
-      <w:pPr>
-        <w:pStyle w:val="Compact"/>
-        <w:numPr>
-          <w:ilvl w:val="0"/>
-          <w:numId w:val="1046"/>
-        </w:numPr>
-      </w:pPr>
-      <w:r>
-        <w:t xml:space="preserve">Q: Range update O(1)?</w:t>
-      </w:r>
-      <w:r>
-        <w:t xml:space="preserve"> </w:t>
-      </w:r>
-      <w:r>
-        <w:rPr>
-          <w:b/>
-          <w:bCs/>
-        </w:rPr>
-        <w:t xml:space="preserve">A: difference array.</w:t>
-      </w:r>
-    </w:p>
-    <w:p>
-      <w:pPr>
-        <w:pStyle w:val="Compact"/>
-        <w:numPr>
-          <w:ilvl w:val="0"/>
-          <w:numId w:val="1046"/>
-        </w:numPr>
-      </w:pPr>
-      <w:r>
-        <w:t xml:space="preserve">Q: Two pointers needs the array to be?</w:t>
-      </w:r>
-      <w:r>
-        <w:t xml:space="preserve"> </w:t>
-      </w:r>
-      <w:r>
-        <w:rPr>
-          <w:b/>
-          <w:bCs/>
-        </w:rPr>
-        <w:t xml:space="preserve">A: sorted/monotonic.</w:t>
-      </w:r>
-    </w:p>
-    <w:p>
-      <w:pPr>
-        <w:pStyle w:val="Compact"/>
-        <w:numPr>
-          <w:ilvl w:val="0"/>
-          <w:numId w:val="1046"/>
-        </w:numPr>
-      </w:pPr>
-      <w:r>
-        <w:t xml:space="preserve">Q: Sliding window — why O(n)?</w:t>
-      </w:r>
-      <w:r>
-        <w:t xml:space="preserve"> </w:t>
-      </w:r>
-      <w:r>
-        <w:rPr>
-          <w:b/>
-          <w:bCs/>
-        </w:rPr>
-        <w:t xml:space="preserve">A: each element added &amp; removed once.</w:t>
-      </w:r>
-    </w:p>
-    <w:p>
-      <w:pPr>
-        <w:pStyle w:val="Compact"/>
-        <w:numPr>
-          <w:ilvl w:val="0"/>
-          <w:numId w:val="1046"/>
-        </w:numPr>
-      </w:pPr>
-      <w:r>
-        <w:t xml:space="preserve">Q: Kadane all-negative bug?</w:t>
-      </w:r>
-      <w:r>
-        <w:t xml:space="preserve"> </w:t>
-      </w:r>
-      <w:r>
-        <w:rPr>
-          <w:b/>
-          <w:bCs/>
-        </w:rPr>
-        <w:t xml:space="preserve">A: init best=a[0], not 0.</w:t>
-      </w:r>
-    </w:p>
-    <w:p>
-      <w:pPr>
-        <w:pStyle w:val="Compact"/>
-        <w:numPr>
-          <w:ilvl w:val="0"/>
-          <w:numId w:val="1046"/>
-        </w:numPr>
-      </w:pPr>
-      <w:r>
-        <w:t xml:space="preserve">Q: Sort 0/1/2 in one pass?</w:t>
-      </w:r>
-      <w:r>
-        <w:t xml:space="preserve"> </w:t>
-      </w:r>
-      <w:r>
-        <w:rPr>
-          <w:b/>
-          <w:bCs/>
-        </w:rPr>
-        <w:t xml:space="preserve">A: Dutch national flag (3 pointers).</w:t>
-      </w:r>
-    </w:p>
-    <w:p>
-      <w:pPr>
-        <w:pStyle w:val="Compact"/>
-        <w:numPr>
-          <w:ilvl w:val="0"/>
-          <w:numId w:val="1046"/>
-        </w:numPr>
-      </w:pPr>
-      <w:r>
-        <w:t xml:space="preserve">Q: Rotate 90° CW?</w:t>
-      </w:r>
-      <w:r>
-        <w:t xml:space="preserve"> </w:t>
-      </w:r>
-      <w:r>
-        <w:rPr>
-          <w:b/>
-          <w:bCs/>
-        </w:rPr>
-        <w:t xml:space="preserve">A: transpose + reverse rows.</w:t>
-      </w:r>
-    </w:p>
-    <w:p>
-      <w:pPr>
-        <w:pStyle w:val="Compact"/>
-        <w:numPr>
-          <w:ilvl w:val="0"/>
-          <w:numId w:val="1046"/>
-        </w:numPr>
-      </w:pPr>
-      <w:r>
-        <w:t xml:space="preserve">Q: Majority element (&gt;n/2) in O(1) space?</w:t>
-      </w:r>
-      <w:r>
-        <w:t xml:space="preserve"> </w:t>
-      </w:r>
-      <w:r>
-        <w:rPr>
-          <w:b/>
-          <w:bCs/>
-        </w:rPr>
-        <w:t xml:space="preserve">A: Moore’s voting (tug of war).</w:t>
-      </w:r>
-    </w:p>
-    <w:p>
-      <w:pPr>
-        <w:pStyle w:val="Compact"/>
-        <w:numPr>
-          <w:ilvl w:val="0"/>
-          <w:numId w:val="1046"/>
-        </w:numPr>
-      </w:pPr>
-      <w:r>
-        <w:t xml:space="preserve">Q: Merge overlapping intervals?</w:t>
-      </w:r>
-      <w:r>
-        <w:t xml:space="preserve"> </w:t>
-      </w:r>
-      <w:r>
-        <w:rPr>
-          <w:b/>
-          <w:bCs/>
-        </w:rPr>
-        <w:t xml:space="preserve">A: sort by start, sweep; overlap if next.start ≤ cur.end.</w:t>
-      </w:r>
-    </w:p>
-    <w:p>
-      <w:pPr>
-        <w:pStyle w:val="Compact"/>
-        <w:numPr>
-          <w:ilvl w:val="0"/>
-          <w:numId w:val="1046"/>
-        </w:numPr>
-      </w:pPr>
-      <w:r>
-        <w:t xml:space="preserve">Q: Values are 1..n, find missing/duplicate in O(1) space?</w:t>
-      </w:r>
-      <w:r>
-        <w:t xml:space="preserve"> </w:t>
-      </w:r>
-      <w:r>
-        <w:rPr>
-          <w:b/>
-          <w:bCs/>
-        </w:rPr>
-        <w:t xml:space="preserve">A: cyclic sort.</w:t>
-      </w:r>
-    </w:p>
-    <w:bookmarkEnd w:id="146"/>
-    <w:bookmarkStart w:id="147" w:name="Xa101d7702d56133f43747c31ff82170f254aa37"/>
-    <w:p>
-      <w:pPr>
-        <w:pStyle w:val="Heading2"/>
-      </w:pPr>
-      <w:r>
-        <w:t xml:space="preserve">Module 2 — Pattern Recognition (how to spot it in an interview)</w:t>
-      </w:r>
-    </w:p>
-    <w:p>
-      <w:pPr>
-        <w:pStyle w:val="Compact"/>
-        <w:numPr>
-          <w:ilvl w:val="0"/>
-          <w:numId w:val="1047"/>
-        </w:numPr>
-      </w:pPr>
-      <w:r>
-        <w:t xml:space="preserve">“Range sum / many queries”</w:t>
-      </w:r>
-      <w:r>
-        <w:t xml:space="preserve"> </w:t>
-      </w:r>
-      <w:r>
-        <w:t xml:space="preserve">→</w:t>
-      </w:r>
-      <w:r>
-        <w:t xml:space="preserve"> </w:t>
-      </w:r>
-      <w:r>
-        <w:rPr>
-          <w:b/>
-          <w:bCs/>
-        </w:rPr>
-        <w:t xml:space="preserve">prefix sum</w:t>
-      </w:r>
-      <w:r>
-        <w:t xml:space="preserve">.</w:t>
-      </w:r>
-    </w:p>
-    <w:p>
-      <w:pPr>
-        <w:pStyle w:val="Compact"/>
-        <w:numPr>
-          <w:ilvl w:val="0"/>
-          <w:numId w:val="1047"/>
-        </w:numPr>
-      </w:pPr>
-      <w:r>
-        <w:t xml:space="preserve">“Range update many times”</w:t>
-      </w:r>
-      <w:r>
-        <w:t xml:space="preserve"> </w:t>
-      </w:r>
-      <w:r>
-        <w:t xml:space="preserve">→</w:t>
-      </w:r>
-      <w:r>
-        <w:t xml:space="preserve"> </w:t>
-      </w:r>
-      <w:r>
-        <w:rPr>
-          <w:b/>
-          <w:bCs/>
-        </w:rPr>
-        <w:t xml:space="preserve">difference array</w:t>
-      </w:r>
-      <w:r>
-        <w:t xml:space="preserve">.</w:t>
-      </w:r>
-    </w:p>
-    <w:p>
-      <w:pPr>
-        <w:pStyle w:val="Compact"/>
-        <w:numPr>
-          <w:ilvl w:val="0"/>
-          <w:numId w:val="1047"/>
-        </w:numPr>
-      </w:pPr>
-      <w:r>
-        <w:t xml:space="preserve">“Sorted array + pair/triplet”</w:t>
-      </w:r>
-      <w:r>
-        <w:t xml:space="preserve"> </w:t>
-      </w:r>
-      <w:r>
-        <w:t xml:space="preserve">→</w:t>
-      </w:r>
-      <w:r>
-        <w:t xml:space="preserve"> </w:t>
-      </w:r>
-      <w:r>
-        <w:rPr>
-          <w:b/>
-          <w:bCs/>
-        </w:rPr>
-        <w:t xml:space="preserve">two pointers</w:t>
-      </w:r>
-      <w:r>
-        <w:t xml:space="preserve">.</w:t>
-      </w:r>
-    </w:p>
-    <w:p>
-      <w:pPr>
-        <w:pStyle w:val="Compact"/>
-        <w:numPr>
-          <w:ilvl w:val="0"/>
-          <w:numId w:val="1047"/>
-        </w:numPr>
-      </w:pPr>
-      <w:r>
-        <w:t xml:space="preserve">“Longest/shortest contiguous subarray/substring with a condition”</w:t>
-      </w:r>
-      <w:r>
-        <w:t xml:space="preserve"> </w:t>
-      </w:r>
-      <w:r>
-        <w:t xml:space="preserve">→</w:t>
-      </w:r>
-      <w:r>
-        <w:t xml:space="preserve"> </w:t>
-      </w:r>
-      <w:r>
-        <w:rPr>
-          <w:b/>
-          <w:bCs/>
-        </w:rPr>
-        <w:t xml:space="preserve">sliding</w:t>
-      </w:r>
-      <w:r>
-        <w:rPr>
-          <w:b/>
-          <w:bCs/>
-        </w:rPr>
-        <w:t xml:space="preserve"> </w:t>
-      </w:r>
-      <w:r>
-        <w:rPr>
-          <w:b/>
-          <w:bCs/>
-        </w:rPr>
-        <w:t xml:space="preserve">window</w:t>
-      </w:r>
-      <w:r>
-        <w:t xml:space="preserve">.</w:t>
-      </w:r>
-    </w:p>
-    <w:p>
-      <w:pPr>
-        <w:pStyle w:val="Compact"/>
-        <w:numPr>
-          <w:ilvl w:val="0"/>
-          <w:numId w:val="1047"/>
-        </w:numPr>
-      </w:pPr>
-      <w:r>
-        <w:t xml:space="preserve">“Max contiguous sum”</w:t>
-      </w:r>
-      <w:r>
-        <w:t xml:space="preserve"> </w:t>
-      </w:r>
-      <w:r>
-        <w:t xml:space="preserve">→</w:t>
-      </w:r>
-      <w:r>
-        <w:t xml:space="preserve"> </w:t>
-      </w:r>
-      <w:r>
-        <w:rPr>
-          <w:b/>
-          <w:bCs/>
-        </w:rPr>
-        <w:t xml:space="preserve">Kadane</w:t>
-      </w:r>
-      <w:r>
-        <w:t xml:space="preserve">.</w:t>
-      </w:r>
-    </w:p>
-    <w:p>
-      <w:pPr>
-        <w:pStyle w:val="Compact"/>
-        <w:numPr>
-          <w:ilvl w:val="0"/>
-          <w:numId w:val="1047"/>
-        </w:numPr>
-      </w:pPr>
-      <w:r>
-        <w:t xml:space="preserve">“Sort into a few categories in place”</w:t>
-      </w:r>
-      <w:r>
-        <w:t xml:space="preserve"> </w:t>
-      </w:r>
-      <w:r>
-        <w:t xml:space="preserve">→</w:t>
-      </w:r>
-      <w:r>
-        <w:t xml:space="preserve"> </w:t>
-      </w:r>
-      <w:r>
-        <w:rPr>
-          <w:b/>
-          <w:bCs/>
-        </w:rPr>
-        <w:t xml:space="preserve">Dutch flag / partition</w:t>
-      </w:r>
-      <w:r>
-        <w:t xml:space="preserve">.</w:t>
-      </w:r>
-    </w:p>
-    <w:p>
-      <w:pPr>
-        <w:pStyle w:val="Compact"/>
-        <w:numPr>
-          <w:ilvl w:val="0"/>
-          <w:numId w:val="1047"/>
-        </w:numPr>
-      </w:pPr>
-      <w:r>
-        <w:t xml:space="preserve">“Subarray sum = k (unsorted)”</w:t>
-      </w:r>
-      <w:r>
-        <w:t xml:space="preserve"> </w:t>
-      </w:r>
-      <w:r>
-        <w:t xml:space="preserve">→</w:t>
-      </w:r>
-      <w:r>
-        <w:t xml:space="preserve"> </w:t>
-      </w:r>
-      <w:r>
-        <w:rPr>
-          <w:b/>
-          <w:bCs/>
-        </w:rPr>
-        <w:t xml:space="preserve">prefix sum + hashmap</w:t>
-      </w:r>
-      <w:r>
-        <w:t xml:space="preserve"> </w:t>
-      </w:r>
-      <w:r>
-        <w:t xml:space="preserve">(Module 7).</w:t>
-      </w:r>
-    </w:p>
-    <w:p>
-      <w:pPr>
-        <w:pStyle w:val="Compact"/>
-        <w:numPr>
-          <w:ilvl w:val="0"/>
-          <w:numId w:val="1047"/>
-        </w:numPr>
-      </w:pPr>
-      <w:r>
-        <w:t xml:space="preserve">“Element appears more than n/2 times”</w:t>
-      </w:r>
-      <w:r>
-        <w:t xml:space="preserve"> </w:t>
-      </w:r>
-      <w:r>
-        <w:t xml:space="preserve">→</w:t>
-      </w:r>
-      <w:r>
-        <w:t xml:space="preserve"> </w:t>
-      </w:r>
-      <w:r>
-        <w:rPr>
-          <w:b/>
-          <w:bCs/>
-        </w:rPr>
-        <w:t xml:space="preserve">Moore’s voting</w:t>
-      </w:r>
-      <w:r>
-        <w:t xml:space="preserve">.</w:t>
-      </w:r>
-    </w:p>
-    <w:p>
-      <w:pPr>
-        <w:pStyle w:val="Compact"/>
-        <w:numPr>
-          <w:ilvl w:val="0"/>
-          <w:numId w:val="1047"/>
-        </w:numPr>
-      </w:pPr>
-      <w:r>
-        <w:t xml:space="preserve">“Overlapping intervals / merge / meeting rooms”</w:t>
-      </w:r>
-      <w:r>
-        <w:t xml:space="preserve"> </w:t>
-      </w:r>
-      <w:r>
-        <w:t xml:space="preserve">→</w:t>
-      </w:r>
-      <w:r>
-        <w:t xml:space="preserve"> </w:t>
-      </w:r>
-      <w:r>
-        <w:rPr>
-          <w:b/>
-          <w:bCs/>
-        </w:rPr>
-        <w:t xml:space="preserve">sort + merge intervals</w:t>
-      </w:r>
-      <w:r>
-        <w:t xml:space="preserve">.</w:t>
-      </w:r>
-    </w:p>
-    <w:p>
-      <w:pPr>
-        <w:pStyle w:val="Compact"/>
-        <w:numPr>
-          <w:ilvl w:val="0"/>
-          <w:numId w:val="1047"/>
-        </w:numPr>
-      </w:pPr>
-      <w:r>
-        <w:t xml:space="preserve">“Array contains 1..n, find missing/duplicate, O(1) space”</w:t>
-      </w:r>
-      <w:r>
-        <w:t xml:space="preserve"> </w:t>
-      </w:r>
-      <w:r>
-        <w:t xml:space="preserve">→</w:t>
-      </w:r>
-      <w:r>
-        <w:t xml:space="preserve"> </w:t>
-      </w:r>
-      <w:r>
-        <w:rPr>
-          <w:b/>
-          <w:bCs/>
-        </w:rPr>
-        <w:t xml:space="preserve">cyclic sort</w:t>
-      </w:r>
-      <w:r>
-        <w:t xml:space="preserve">.</w:t>
-      </w:r>
-    </w:p>
-    <w:bookmarkEnd w:id="147"/>
-    <w:bookmarkStart w:id="148" w:name="Xe3b5cc6846e3573366b27203e9fc801d53a8909"/>
-    <w:p>
-      <w:pPr>
-        <w:pStyle w:val="Heading2"/>
-      </w:pPr>
-      <w:r>
-        <w:t xml:space="preserve">Module 2 — Interview Questions (with follow-ups)</w:t>
-      </w:r>
-    </w:p>
-    <w:p>
-      <w:pPr>
-        <w:pStyle w:val="Compact"/>
-        <w:numPr>
-          <w:ilvl w:val="0"/>
-          <w:numId w:val="1048"/>
-        </w:numPr>
-      </w:pPr>
+        <w:t xml:space="preserve">Rule of thumb:</w:t>
+      </w:r>
+      <w:r>
+        <w:t xml:space="preserve"> </w:t>
+      </w:r>
       <w:r>
         <w:rPr>
           <w:i/>
           <w:iCs/>
         </w:rPr>
-        <w:t xml:space="preserve">How is dynamic-array append O(1)?</w:t>
-      </w:r>
-      <w:r>
-        <w:t xml:space="preserve"> </w:t>
-      </w:r>
-      <w:r>
-        <w:t xml:space="preserve">FU:</w:t>
+        <w:t xml:space="preserve">contiguous</w:t>
+      </w:r>
+      <w:r>
+        <w:t xml:space="preserve"> </w:t>
+      </w:r>
+      <w:r>
+        <w:t xml:space="preserve">problems (max sum, window) use two</w:t>
+      </w:r>
+      <w:r>
+        <w:t xml:space="preserve"> </w:t>
+      </w:r>
+      <w:r>
+        <w:t xml:space="preserve">pointers/sliding window/Kadane;</w:t>
       </w:r>
       <w:r>
         <w:t xml:space="preserve"> </w:t>
@@ -11977,73 +11437,800 @@
           <w:i/>
           <w:iCs/>
         </w:rPr>
-        <w:t xml:space="preserve">what about +1 growth?</w:t>
-      </w:r>
-      <w:r>
-        <w:t xml:space="preserve"> </w:t>
-      </w:r>
-      <w:r>
-        <w:t xml:space="preserve">→ O(n²).</w:t>
-      </w:r>
-    </w:p>
-    <w:p>
-      <w:pPr>
-        <w:pStyle w:val="Compact"/>
-        <w:numPr>
-          <w:ilvl w:val="0"/>
-          <w:numId w:val="1048"/>
-        </w:numPr>
-      </w:pPr>
+        <w:t xml:space="preserve">non-contiguous</w:t>
+      </w:r>
+      <w:r>
+        <w:t xml:space="preserve"> </w:t>
+      </w:r>
+      <w:r>
+        <w:t xml:space="preserve">problems (LIS, LCS) usually</w:t>
+      </w:r>
+      <w:r>
+        <w:t xml:space="preserve"> </w:t>
+      </w:r>
+      <w:r>
+        <w:t xml:space="preserve">need</w:t>
+      </w:r>
+      <w:r>
+        <w:t xml:space="preserve"> </w:t>
+      </w:r>
+      <w:r>
+        <w:rPr>
+          <w:b/>
+          <w:bCs/>
+        </w:rPr>
+        <w:t xml:space="preserve">DP</w:t>
+      </w:r>
+      <w:r>
+        <w:t xml:space="preserve"> </w:t>
+      </w:r>
+      <w:r>
+        <w:t xml:space="preserve">(Module 14). Picking the wrong tool here is a classic mistake.</w:t>
+      </w:r>
+    </w:p>
+    <w:p>
+      <w:pPr>
+        <w:pStyle w:val="BlockText"/>
+      </w:pPr>
+      <w:r>
+        <w:rPr>
+          <w:b/>
+          <w:bCs/>
+        </w:rPr>
+        <w:t xml:space="preserve">Memory hook:</w:t>
+      </w:r>
+      <w:r>
+        <w:t xml:space="preserve"> </w:t>
+      </w:r>
       <w:r>
         <w:rPr>
           <w:i/>
           <w:iCs/>
         </w:rPr>
-        <w:t xml:space="preserve">Make range sum O(1).</w:t>
-      </w:r>
-      <w:r>
-        <w:t xml:space="preserve"> </w:t>
-      </w:r>
-      <w:r>
-        <w:t xml:space="preserve">FU:</w:t>
-      </w:r>
-      <w:r>
-        <w:t xml:space="preserve"> </w:t>
+        <w:t xml:space="preserve">subARRAY = a continuous ARRAY slice; subSEQUENCE = pick some,</w:t>
       </w:r>
       <w:r>
         <w:rPr>
           <w:i/>
           <w:iCs/>
         </w:rPr>
-        <w:t xml:space="preserve">for 2D?</w:t>
-      </w:r>
-      <w:r>
-        <w:t xml:space="preserve"> </w:t>
-      </w:r>
-      <w:r>
-        <w:t xml:space="preserve">→ inclusion-exclusion.</w:t>
-      </w:r>
-    </w:p>
-    <w:p>
-      <w:pPr>
-        <w:pStyle w:val="Compact"/>
-        <w:numPr>
-          <w:ilvl w:val="0"/>
-          <w:numId w:val="1048"/>
-        </w:numPr>
-      </w:pPr>
+        <w:t xml:space="preserve"> </w:t>
+      </w:r>
       <w:r>
         <w:rPr>
           <w:i/>
           <w:iCs/>
         </w:rPr>
-        <w:t xml:space="preserve">Solve 3Sum.</w:t>
-      </w:r>
-      <w:r>
-        <w:t xml:space="preserve"> </w:t>
-      </w:r>
-      <w:r>
-        <w:t xml:space="preserve">FU:</w:t>
+        <w:t xml:space="preserve">keep the SEQUENCE (order).</w:t>
+      </w:r>
+    </w:p>
+    <w:bookmarkEnd w:id="145"/>
+    <w:bookmarkStart w:id="149" w:name="a-array-rotation-the-reversal-trick"/>
+    <w:p>
+      <w:pPr>
+        <w:pStyle w:val="Heading3"/>
+      </w:pPr>
+      <w:r>
+        <w:t xml:space="preserve">A) Array Rotation — the reversal trick</w:t>
+      </w:r>
+    </w:p>
+    <w:p>
+      <w:pPr>
+        <w:pStyle w:val="FirstParagraph"/>
+      </w:pPr>
+      <w:r>
+        <w:rPr>
+          <w:b/>
+          <w:bCs/>
+        </w:rPr>
+        <w:t xml:space="preserve">Problem:</w:t>
+      </w:r>
+      <w:r>
+        <w:t xml:space="preserve"> </w:t>
+      </w:r>
+      <w:r>
+        <w:t xml:space="preserve">rotate an array left/right by</w:t>
+      </w:r>
+      <w:r>
+        <w:t xml:space="preserve"> </w:t>
+      </w:r>
+      <w:r>
+        <w:rPr>
+          <w:rStyle w:val="VerbatimChar"/>
+        </w:rPr>
+        <w:t xml:space="preserve">k</w:t>
+      </w:r>
+      <w:r>
+        <w:t xml:space="preserve"> </w:t>
+      </w:r>
+      <w:r>
+        <w:t xml:space="preserve">places, in</w:t>
+      </w:r>
+      <w:r>
+        <w:t xml:space="preserve"> </w:t>
+      </w:r>
+      <w:r>
+        <w:rPr>
+          <w:b/>
+          <w:bCs/>
+        </w:rPr>
+        <w:t xml:space="preserve">O(1)</w:t>
+      </w:r>
+      <w:r>
+        <w:t xml:space="preserve"> </w:t>
+      </w:r>
+      <w:r>
+        <w:t xml:space="preserve">extra space.</w:t>
+      </w:r>
+      <w:r>
+        <w:t xml:space="preserve"> </w:t>
+      </w:r>
+      <w:r>
+        <w:t xml:space="preserve">Example:</w:t>
+      </w:r>
+      <w:r>
+        <w:t xml:space="preserve"> </w:t>
+      </w:r>
+      <w:r>
+        <w:rPr>
+          <w:rStyle w:val="VerbatimChar"/>
+        </w:rPr>
+        <w:t xml:space="preserve">[1,2,3,4,5,6,7]</w:t>
+      </w:r>
+      <w:r>
+        <w:t xml:space="preserve"> </w:t>
+      </w:r>
+      <w:r>
+        <w:t xml:space="preserve">rotated right by</w:t>
+      </w:r>
+      <w:r>
+        <w:t xml:space="preserve"> </w:t>
+      </w:r>
+      <w:r>
+        <w:rPr>
+          <w:rStyle w:val="VerbatimChar"/>
+        </w:rPr>
+        <w:t xml:space="preserve">k=3</w:t>
+      </w:r>
+      <w:r>
+        <w:t xml:space="preserve"> </w:t>
+      </w:r>
+      <w:r>
+        <w:t xml:space="preserve">→</w:t>
+      </w:r>
+      <w:r>
+        <w:t xml:space="preserve"> </w:t>
+      </w:r>
+      <w:r>
+        <w:rPr>
+          <w:rStyle w:val="VerbatimChar"/>
+        </w:rPr>
+        <w:t xml:space="preserve">[5,6,7,1,2,3,4]</w:t>
+      </w:r>
+      <w:r>
+        <w:t xml:space="preserve">.</w:t>
+      </w:r>
+    </w:p>
+    <w:p>
+      <w:pPr>
+        <w:pStyle w:val="BodyText"/>
+      </w:pPr>
+      <w:r>
+        <w:rPr>
+          <w:b/>
+          <w:bCs/>
+        </w:rPr>
+        <w:t xml:space="preserve">Intuition (memory hook —</w:t>
+      </w:r>
+      <w:r>
+        <w:rPr>
+          <w:b/>
+          <w:bCs/>
+        </w:rPr>
+        <w:t xml:space="preserve"> </w:t>
+      </w:r>
+      <w:r>
+        <w:rPr>
+          <w:b/>
+          <w:bCs/>
+        </w:rPr>
+        <w:t xml:space="preserve">“reverse three times”</w:t>
+      </w:r>
+      <w:r>
+        <w:rPr>
+          <w:b/>
+          <w:bCs/>
+        </w:rPr>
+        <w:t xml:space="preserve">):</w:t>
+      </w:r>
+      <w:r>
+        <w:t xml:space="preserve"> </w:t>
+      </w:r>
+      <w:r>
+        <w:t xml:space="preserve">reverse the whole array,</w:t>
+      </w:r>
+      <w:r>
+        <w:t xml:space="preserve"> </w:t>
+      </w:r>
+      <w:r>
+        <w:t xml:space="preserve">then reverse the two pieces. The parts fall into place.</w:t>
+      </w:r>
+    </w:p>
+    <w:p>
+      <w:pPr>
+        <w:pStyle w:val="CaptionedFigure"/>
+      </w:pPr>
+      <w:r>
+        <w:drawing>
+          <wp:inline>
+            <wp:extent cx="5334000" cy="2750170"/>
+            <wp:effectExtent b="0" l="0" r="0" t="0"/>
+            <wp:docPr descr="Right-rotate by k using three reversals: reverse all, then reverse the first k, then reverse the rest." title="" id="147" name="Picture"/>
+            <a:graphic>
+              <a:graphicData uri="http://schemas.openxmlformats.org/drawingml/2006/picture">
+                <pic:pic>
+                  <pic:nvPicPr>
+                    <pic:cNvPr descr="images/150_rotation_reversal.png" id="148" name="Picture"/>
+                    <pic:cNvPicPr>
+                      <a:picLocks noChangeArrowheads="1" noChangeAspect="1"/>
+                    </pic:cNvPicPr>
+                  </pic:nvPicPr>
+                  <pic:blipFill>
+                    <a:blip r:embed="rId146"/>
+                    <a:stretch>
+                      <a:fillRect/>
+                    </a:stretch>
+                  </pic:blipFill>
+                  <pic:spPr bwMode="auto">
+                    <a:xfrm>
+                      <a:off x="0" y="0"/>
+                      <a:ext cx="5334000" cy="2750170"/>
+                    </a:xfrm>
+                    <a:prstGeom prst="rect">
+                      <a:avLst/>
+                    </a:prstGeom>
+                    <a:noFill/>
+                    <a:ln w="9525">
+                      <a:noFill/>
+                      <a:headEnd/>
+                      <a:tailEnd/>
+                    </a:ln>
+                  </pic:spPr>
+                </pic:pic>
+              </a:graphicData>
+            </a:graphic>
+          </wp:inline>
+        </w:drawing>
+      </w:r>
+    </w:p>
+    <w:p>
+      <w:pPr>
+        <w:pStyle w:val="ImageCaption"/>
+      </w:pPr>
+      <w:r>
+        <w:t xml:space="preserve">Right-rotate by k using three reversals: reverse all, then reverse the first k, then reverse the rest.</w:t>
+      </w:r>
+    </w:p>
+    <w:p>
+      <w:pPr>
+        <w:pStyle w:val="SourceCode"/>
+      </w:pPr>
+      <w:r>
+        <w:rPr>
+          <w:rStyle w:val="VerbatimChar"/>
+        </w:rPr>
+        <w:t xml:space="preserve"># BRUTE FORCE: rotate one step, k times     Time O(n*k), Space O(1)</w:t>
+      </w:r>
+      <w:r>
+        <w:br/>
+      </w:r>
+      <w:r>
+        <w:rPr>
+          <w:rStyle w:val="VerbatimChar"/>
+        </w:rPr>
+        <w:t xml:space="preserve">repeat k times: move last element to front (shift the rest)</w:t>
+      </w:r>
+      <w:r>
+        <w:br/>
+      </w:r>
+      <w:r>
+        <w:br/>
+      </w:r>
+      <w:r>
+        <w:rPr>
+          <w:rStyle w:val="VerbatimChar"/>
+        </w:rPr>
+        <w:t xml:space="preserve"># BETTER: use an extra array                 Time O(n), Space O(n)</w:t>
+      </w:r>
+      <w:r>
+        <w:br/>
+      </w:r>
+      <w:r>
+        <w:rPr>
+          <w:rStyle w:val="VerbatimChar"/>
+        </w:rPr>
+        <w:t xml:space="preserve">new[(i + k) % n] = arr[i]</w:t>
+      </w:r>
+      <w:r>
+        <w:br/>
+      </w:r>
+      <w:r>
+        <w:br/>
+      </w:r>
+      <w:r>
+        <w:rPr>
+          <w:rStyle w:val="VerbatimChar"/>
+        </w:rPr>
+        <w:t xml:space="preserve"># OPTIMAL: three reversals (right rotate)     Time O(n), Space O(1)</w:t>
+      </w:r>
+      <w:r>
+        <w:br/>
+      </w:r>
+      <w:r>
+        <w:rPr>
+          <w:rStyle w:val="VerbatimChar"/>
+        </w:rPr>
+        <w:t xml:space="preserve">k = k % n                 # k may exceed n</w:t>
+      </w:r>
+      <w:r>
+        <w:br/>
+      </w:r>
+      <w:r>
+        <w:rPr>
+          <w:rStyle w:val="VerbatimChar"/>
+        </w:rPr>
+        <w:t xml:space="preserve">reverse(arr, 0, n-1)      # reverse the whole array</w:t>
+      </w:r>
+      <w:r>
+        <w:br/>
+      </w:r>
+      <w:r>
+        <w:rPr>
+          <w:rStyle w:val="VerbatimChar"/>
+        </w:rPr>
+        <w:t xml:space="preserve">reverse(arr, 0, k-1)      # reverse first k</w:t>
+      </w:r>
+      <w:r>
+        <w:br/>
+      </w:r>
+      <w:r>
+        <w:rPr>
+          <w:rStyle w:val="VerbatimChar"/>
+        </w:rPr>
+        <w:t xml:space="preserve">reverse(arr, k, n-1)      # reverse the rest</w:t>
+      </w:r>
+    </w:p>
+    <w:p>
+      <w:pPr>
+        <w:pStyle w:val="Compact"/>
+        <w:numPr>
+          <w:ilvl w:val="0"/>
+          <w:numId w:val="1046"/>
+        </w:numPr>
+      </w:pPr>
+      <w:r>
+        <w:rPr>
+          <w:b/>
+          <w:bCs/>
+        </w:rPr>
+        <w:t xml:space="preserve">Why</w:t>
+      </w:r>
+      <w:r>
+        <w:rPr>
+          <w:b/>
+          <w:bCs/>
+        </w:rPr>
+        <w:t xml:space="preserve"> </w:t>
+      </w:r>
+      <w:r>
+        <w:rPr>
+          <w:rStyle w:val="VerbatimChar"/>
+          <w:b/>
+          <w:bCs/>
+        </w:rPr>
+        <w:t xml:space="preserve">k % n</w:t>
+      </w:r>
+      <w:r>
+        <w:rPr>
+          <w:b/>
+          <w:bCs/>
+        </w:rPr>
+        <w:t xml:space="preserve">:</w:t>
+      </w:r>
+      <w:r>
+        <w:t xml:space="preserve"> </w:t>
+      </w:r>
+      <w:r>
+        <w:t xml:space="preserve">rotating by</w:t>
+      </w:r>
+      <w:r>
+        <w:t xml:space="preserve"> </w:t>
+      </w:r>
+      <w:r>
+        <w:rPr>
+          <w:rStyle w:val="VerbatimChar"/>
+        </w:rPr>
+        <w:t xml:space="preserve">n</w:t>
+      </w:r>
+      <w:r>
+        <w:t xml:space="preserve"> </w:t>
+      </w:r>
+      <w:r>
+        <w:t xml:space="preserve">gives back the same array, so only</w:t>
+      </w:r>
+      <w:r>
+        <w:t xml:space="preserve"> </w:t>
+      </w:r>
+      <w:r>
+        <w:rPr>
+          <w:rStyle w:val="VerbatimChar"/>
+        </w:rPr>
+        <w:t xml:space="preserve">k mod n</w:t>
+      </w:r>
+      <w:r>
+        <w:t xml:space="preserve"> </w:t>
+      </w:r>
+      <w:r>
+        <w:t xml:space="preserve">matters. Forgetting this is the #1 bug.</w:t>
+      </w:r>
+    </w:p>
+    <w:p>
+      <w:pPr>
+        <w:pStyle w:val="Compact"/>
+        <w:numPr>
+          <w:ilvl w:val="0"/>
+          <w:numId w:val="1046"/>
+        </w:numPr>
+      </w:pPr>
+      <w:r>
+        <w:rPr>
+          <w:b/>
+          <w:bCs/>
+        </w:rPr>
+        <w:t xml:space="preserve">Left rotate by k = right rotate by n−k</w:t>
+      </w:r>
+      <w:r>
+        <w:t xml:space="preserve"> </w:t>
+      </w:r>
+      <w:r>
+        <w:t xml:space="preserve">(or reverse the three pieces in the</w:t>
+      </w:r>
+      <w:r>
+        <w:t xml:space="preserve"> </w:t>
+      </w:r>
+      <w:r>
+        <w:t xml:space="preserve">other order).</w:t>
+      </w:r>
+    </w:p>
+    <w:p>
+      <w:pPr>
+        <w:pStyle w:val="Compact"/>
+        <w:numPr>
+          <w:ilvl w:val="0"/>
+          <w:numId w:val="1046"/>
+        </w:numPr>
+      </w:pPr>
+      <w:r>
+        <w:rPr>
+          <w:b/>
+          <w:bCs/>
+        </w:rPr>
+        <w:t xml:space="preserve">Problems:</w:t>
+      </w:r>
+      <w:r>
+        <w:t xml:space="preserve"> </w:t>
+      </w:r>
+      <w:r>
+        <w:t xml:space="preserve">Rotate Array (LC 189); Rotate a matrix reuses the same idea.</w:t>
+      </w:r>
+    </w:p>
+    <w:bookmarkEnd w:id="149"/>
+    <w:bookmarkStart w:id="150" w:name="X83aa8c3b1e3327a9607e43590f1a464aa4f7bbb"/>
+    <w:p>
+      <w:pPr>
+        <w:pStyle w:val="Heading3"/>
+      </w:pPr>
+      <w:r>
+        <w:t xml:space="preserve">B) Next Permutation (the</w:t>
+      </w:r>
+      <w:r>
+        <w:t xml:space="preserve"> </w:t>
+      </w:r>
+      <w:r>
+        <w:t xml:space="preserve">“just bigger”</w:t>
+      </w:r>
+      <w:r>
+        <w:t xml:space="preserve"> </w:t>
+      </w:r>
+      <w:r>
+        <w:t xml:space="preserve">arrangement)</w:t>
+      </w:r>
+    </w:p>
+    <w:p>
+      <w:pPr>
+        <w:pStyle w:val="FirstParagraph"/>
+      </w:pPr>
+      <w:r>
+        <w:rPr>
+          <w:b/>
+          <w:bCs/>
+        </w:rPr>
+        <w:t xml:space="preserve">Problem:</w:t>
+      </w:r>
+      <w:r>
+        <w:t xml:space="preserve"> </w:t>
+      </w:r>
+      <w:r>
+        <w:t xml:space="preserve">rearrange the numbers into the</w:t>
+      </w:r>
+      <w:r>
+        <w:t xml:space="preserve"> </w:t>
+      </w:r>
+      <w:r>
+        <w:rPr>
+          <w:b/>
+          <w:bCs/>
+        </w:rPr>
+        <w:t xml:space="preserve">next lexicographically greater</w:t>
+      </w:r>
+      <w:r>
+        <w:t xml:space="preserve"> </w:t>
+      </w:r>
+      <w:r>
+        <w:t xml:space="preserve">permutation, in place, O(n). If it is already the largest, wrap to the smallest</w:t>
+      </w:r>
+      <w:r>
+        <w:t xml:space="preserve"> </w:t>
+      </w:r>
+      <w:r>
+        <w:t xml:space="preserve">(fully sorted). This is what C++</w:t>
+      </w:r>
+      <w:r>
+        <w:t xml:space="preserve"> </w:t>
+      </w:r>
+      <w:r>
+        <w:rPr>
+          <w:rStyle w:val="VerbatimChar"/>
+        </w:rPr>
+        <w:t xml:space="preserve">std::next_permutation</w:t>
+      </w:r>
+      <w:r>
+        <w:t xml:space="preserve"> </w:t>
+      </w:r>
+      <w:r>
+        <w:t xml:space="preserve">does.</w:t>
+      </w:r>
+    </w:p>
+    <w:p>
+      <w:pPr>
+        <w:pStyle w:val="BodyText"/>
+      </w:pPr>
+      <w:r>
+        <w:rPr>
+          <w:b/>
+          <w:bCs/>
+        </w:rPr>
+        <w:t xml:space="preserve">Intuition (memory hook —</w:t>
+      </w:r>
+      <w:r>
+        <w:rPr>
+          <w:b/>
+          <w:bCs/>
+        </w:rPr>
+        <w:t xml:space="preserve"> </w:t>
+      </w:r>
+      <w:r>
+        <w:rPr>
+          <w:b/>
+          <w:bCs/>
+        </w:rPr>
+        <w:t xml:space="preserve">“find the dip, swap, flip”</w:t>
+      </w:r>
+      <w:r>
+        <w:rPr>
+          <w:b/>
+          <w:bCs/>
+        </w:rPr>
+        <w:t xml:space="preserve">):</w:t>
+      </w:r>
+    </w:p>
+    <w:p>
+      <w:pPr>
+        <w:pStyle w:val="SourceCode"/>
+      </w:pPr>
+      <w:r>
+        <w:rPr>
+          <w:rStyle w:val="VerbatimChar"/>
+        </w:rPr>
+        <w:t xml:space="preserve"># OPTIMAL                                    Time O(n), Space O(1)</w:t>
+      </w:r>
+      <w:r>
+        <w:br/>
+      </w:r>
+      <w:r>
+        <w:rPr>
+          <w:rStyle w:val="VerbatimChar"/>
+        </w:rPr>
+        <w:t xml:space="preserve">1. Scan from the right; find the first index i where arr[i] &lt; arr[i+1].</w:t>
+      </w:r>
+      <w:r>
+        <w:br/>
+      </w:r>
+      <w:r>
+        <w:rPr>
+          <w:rStyle w:val="VerbatimChar"/>
+        </w:rPr>
+        <w:t xml:space="preserve">   (This is the "pivot" — the last place that can be increased.)</w:t>
+      </w:r>
+      <w:r>
+        <w:br/>
+      </w:r>
+      <w:r>
+        <w:rPr>
+          <w:rStyle w:val="VerbatimChar"/>
+        </w:rPr>
+        <w:t xml:space="preserve">   If none exists, the array is descending → reverse it all (smallest). Done.</w:t>
+      </w:r>
+      <w:r>
+        <w:br/>
+      </w:r>
+      <w:r>
+        <w:rPr>
+          <w:rStyle w:val="VerbatimChar"/>
+        </w:rPr>
+        <w:t xml:space="preserve">2. Scan from the right; find the first j with arr[j] &gt; arr[i].</w:t>
+      </w:r>
+      <w:r>
+        <w:br/>
+      </w:r>
+      <w:r>
+        <w:rPr>
+          <w:rStyle w:val="VerbatimChar"/>
+        </w:rPr>
+        <w:t xml:space="preserve">3. Swap arr[i] and arr[j].</w:t>
+      </w:r>
+      <w:r>
+        <w:br/>
+      </w:r>
+      <w:r>
+        <w:rPr>
+          <w:rStyle w:val="VerbatimChar"/>
+        </w:rPr>
+        <w:t xml:space="preserve">4. Reverse the suffix after i (arr[i+1..n-1]) so it is smallest possible.</w:t>
+      </w:r>
+    </w:p>
+    <w:p>
+      <w:pPr>
+        <w:pStyle w:val="FirstParagraph"/>
+      </w:pPr>
+      <w:r>
+        <w:rPr>
+          <w:b/>
+          <w:bCs/>
+        </w:rPr>
+        <w:t xml:space="preserve">Dry run</w:t>
+      </w:r>
+      <w:r>
+        <w:t xml:space="preserve"> </w:t>
+      </w:r>
+      <w:r>
+        <w:t xml:space="preserve">on</w:t>
+      </w:r>
+      <w:r>
+        <w:t xml:space="preserve"> </w:t>
+      </w:r>
+      <w:r>
+        <w:rPr>
+          <w:rStyle w:val="VerbatimChar"/>
+        </w:rPr>
+        <w:t xml:space="preserve">[1,2,3]</w:t>
+      </w:r>
+      <w:r>
+        <w:t xml:space="preserve">:</w:t>
+      </w:r>
+    </w:p>
+    <w:p>
+      <w:pPr>
+        <w:pStyle w:val="SourceCode"/>
+      </w:pPr>
+      <w:r>
+        <w:rPr>
+          <w:rStyle w:val="VerbatimChar"/>
+        </w:rPr>
+        <w:t xml:space="preserve">[1,2,3]</w:t>
+      </w:r>
+      <w:r>
+        <w:br/>
+      </w:r>
+      <w:r>
+        <w:rPr>
+          <w:rStyle w:val="VerbatimChar"/>
+        </w:rPr>
+        <w:t xml:space="preserve">step1: from right, 2 &lt; 3 → pivot i = 1 (value 2)</w:t>
+      </w:r>
+      <w:r>
+        <w:br/>
+      </w:r>
+      <w:r>
+        <w:rPr>
+          <w:rStyle w:val="VerbatimChar"/>
+        </w:rPr>
+        <w:t xml:space="preserve">step2: from right, first &gt; 2 is 3 → j = 2</w:t>
+      </w:r>
+      <w:r>
+        <w:br/>
+      </w:r>
+      <w:r>
+        <w:rPr>
+          <w:rStyle w:val="VerbatimChar"/>
+        </w:rPr>
+        <w:t xml:space="preserve">step3: swap(2,3)  → [1,3,2]</w:t>
+      </w:r>
+      <w:r>
+        <w:br/>
+      </w:r>
+      <w:r>
+        <w:rPr>
+          <w:rStyle w:val="VerbatimChar"/>
+        </w:rPr>
+        <w:t xml:space="preserve">step4: reverse suffix after i (just [2]) → [1,3,2]   ✓ next perm</w:t>
+      </w:r>
+    </w:p>
+    <w:p>
+      <w:pPr>
+        <w:pStyle w:val="FirstParagraph"/>
+      </w:pPr>
+      <w:r>
+        <w:t xml:space="preserve">Another:</w:t>
+      </w:r>
+      <w:r>
+        <w:t xml:space="preserve"> </w:t>
+      </w:r>
+      <w:r>
+        <w:rPr>
+          <w:rStyle w:val="VerbatimChar"/>
+        </w:rPr>
+        <w:t xml:space="preserve">[3,2,1]</w:t>
+      </w:r>
+      <w:r>
+        <w:t xml:space="preserve"> </w:t>
+      </w:r>
+      <w:r>
+        <w:t xml:space="preserve">has no pivot (fully descending) → reverse →</w:t>
+      </w:r>
+      <w:r>
+        <w:t xml:space="preserve"> </w:t>
+      </w:r>
+      <w:r>
+        <w:rPr>
+          <w:rStyle w:val="VerbatimChar"/>
+        </w:rPr>
+        <w:t xml:space="preserve">[1,2,3]</w:t>
+      </w:r>
+      <w:r>
+        <w:t xml:space="preserve">.</w:t>
+      </w:r>
+    </w:p>
+    <w:p>
+      <w:pPr>
+        <w:pStyle w:val="Compact"/>
+        <w:numPr>
+          <w:ilvl w:val="0"/>
+          <w:numId w:val="1047"/>
+        </w:numPr>
+      </w:pPr>
+      <w:r>
+        <w:rPr>
+          <w:b/>
+          <w:bCs/>
+        </w:rPr>
+        <w:t xml:space="preserve">Why it works:</w:t>
+      </w:r>
+      <w:r>
+        <w:t xml:space="preserve"> </w:t>
+      </w:r>
+      <w:r>
+        <w:t xml:space="preserve">to get the</w:t>
       </w:r>
       <w:r>
         <w:t xml:space="preserve"> </w:t>
@@ -12053,13 +12240,177 @@
           <w:i/>
           <w:iCs/>
         </w:rPr>
-        <w:t xml:space="preserve">handle duplicates; complexity?</w:t>
-      </w:r>
-      <w:r>
-        <w:t xml:space="preserve"> </w:t>
-      </w:r>
-      <w:r>
-        <w:t xml:space="preserve">→ O(n²).</w:t>
+        <w:t xml:space="preserve">smallest</w:t>
+      </w:r>
+      <w:r>
+        <w:t xml:space="preserve"> </w:t>
+      </w:r>
+      <w:r>
+        <w:t xml:space="preserve">increase, we bump the rightmost digit</w:t>
+      </w:r>
+      <w:r>
+        <w:t xml:space="preserve"> </w:t>
+      </w:r>
+      <w:r>
+        <w:t xml:space="preserve">that can grow, use the smallest value larger than it, then make the tail as</w:t>
+      </w:r>
+      <w:r>
+        <w:t xml:space="preserve"> </w:t>
+      </w:r>
+      <w:r>
+        <w:t xml:space="preserve">small as possible (ascending).</w:t>
+      </w:r>
+    </w:p>
+    <w:p>
+      <w:pPr>
+        <w:pStyle w:val="Compact"/>
+        <w:numPr>
+          <w:ilvl w:val="0"/>
+          <w:numId w:val="1047"/>
+        </w:numPr>
+      </w:pPr>
+      <w:r>
+        <w:rPr>
+          <w:b/>
+          <w:bCs/>
+        </w:rPr>
+        <w:t xml:space="preserve">Problems:</w:t>
+      </w:r>
+      <w:r>
+        <w:t xml:space="preserve"> </w:t>
+      </w:r>
+      <w:r>
+        <w:t xml:space="preserve">Next Permutation (LC 31); Permutation Sequence (LC 60).</w:t>
+      </w:r>
+    </w:p>
+    <w:bookmarkEnd w:id="150"/>
+    <w:bookmarkStart w:id="151" w:name="X57901c5a11ed47fdc7a640b999c823ea08d2761"/>
+    <w:p>
+      <w:pPr>
+        <w:pStyle w:val="Heading3"/>
+      </w:pPr>
+      <w:r>
+        <w:t xml:space="preserve">C) Binary Search on an Array (the O(log n) workhorse)</w:t>
+      </w:r>
+    </w:p>
+    <w:p>
+      <w:pPr>
+        <w:pStyle w:val="FirstParagraph"/>
+      </w:pPr>
+      <w:r>
+        <w:t xml:space="preserve">Any</w:t>
+      </w:r>
+      <w:r>
+        <w:t xml:space="preserve"> </w:t>
+      </w:r>
+      <w:r>
+        <w:rPr>
+          <w:b/>
+          <w:bCs/>
+        </w:rPr>
+        <w:t xml:space="preserve">sorted</w:t>
+      </w:r>
+      <w:r>
+        <w:t xml:space="preserve"> </w:t>
+      </w:r>
+      <w:r>
+        <w:t xml:space="preserve">array supports search in</w:t>
+      </w:r>
+      <w:r>
+        <w:t xml:space="preserve"> </w:t>
+      </w:r>
+      <w:r>
+        <w:rPr>
+          <w:b/>
+          <w:bCs/>
+        </w:rPr>
+        <w:t xml:space="preserve">O(log n)</w:t>
+      </w:r>
+      <w:r>
+        <w:t xml:space="preserve"> </w:t>
+      </w:r>
+      <w:r>
+        <w:t xml:space="preserve">by repeatedly halving the</w:t>
+      </w:r>
+      <w:r>
+        <w:t xml:space="preserve"> </w:t>
+      </w:r>
+      <w:r>
+        <w:t xml:space="preserve">search range. Know the exact template — off-by-one bugs here are common.</w:t>
+      </w:r>
+    </w:p>
+    <w:p>
+      <w:pPr>
+        <w:pStyle w:val="SourceCode"/>
+      </w:pPr>
+      <w:r>
+        <w:rPr>
+          <w:rStyle w:val="VerbatimChar"/>
+        </w:rPr>
+        <w:t xml:space="preserve"># Standard binary search (find target's index, or -1)   Time O(log n), Space O(1)</w:t>
+      </w:r>
+      <w:r>
+        <w:br/>
+      </w:r>
+      <w:r>
+        <w:rPr>
+          <w:rStyle w:val="VerbatimChar"/>
+        </w:rPr>
+        <w:t xml:space="preserve">lo = 0; hi = n - 1</w:t>
+      </w:r>
+      <w:r>
+        <w:br/>
+      </w:r>
+      <w:r>
+        <w:rPr>
+          <w:rStyle w:val="VerbatimChar"/>
+        </w:rPr>
+        <w:t xml:space="preserve">while lo &lt;= hi:</w:t>
+      </w:r>
+      <w:r>
+        <w:br/>
+      </w:r>
+      <w:r>
+        <w:rPr>
+          <w:rStyle w:val="VerbatimChar"/>
+        </w:rPr>
+        <w:t xml:space="preserve">    mid = lo + (hi - lo) / 2      # overflow-safe midpoint (Module 1)</w:t>
+      </w:r>
+      <w:r>
+        <w:br/>
+      </w:r>
+      <w:r>
+        <w:rPr>
+          <w:rStyle w:val="VerbatimChar"/>
+        </w:rPr>
+        <w:t xml:space="preserve">    if   arr[mid] == target: return mid</w:t>
+      </w:r>
+      <w:r>
+        <w:br/>
+      </w:r>
+      <w:r>
+        <w:rPr>
+          <w:rStyle w:val="VerbatimChar"/>
+        </w:rPr>
+        <w:t xml:space="preserve">    elif arr[mid] &lt;  target: lo = mid + 1</w:t>
+      </w:r>
+      <w:r>
+        <w:br/>
+      </w:r>
+      <w:r>
+        <w:rPr>
+          <w:rStyle w:val="VerbatimChar"/>
+        </w:rPr>
+        <w:t xml:space="preserve">    else:                    hi = mid - 1</w:t>
+      </w:r>
+      <w:r>
+        <w:br/>
+      </w:r>
+      <w:r>
+        <w:rPr>
+          <w:rStyle w:val="VerbatimChar"/>
+        </w:rPr>
+        <w:t xml:space="preserve">return -1</w:t>
       </w:r>
     </w:p>
     <w:p>
@@ -12072,26 +12423,49 @@
       </w:pPr>
       <w:r>
         <w:rPr>
-          <w:i/>
-          <w:iCs/>
-        </w:rPr>
-        <w:t xml:space="preserve">Longest substring without repeats.</w:t>
-      </w:r>
-      <w:r>
-        <w:t xml:space="preserve"> </w:t>
-      </w:r>
-      <w:r>
-        <w:t xml:space="preserve">FU:</w:t>
-      </w:r>
-      <w:r>
-        <w:t xml:space="preserve"> </w:t>
-      </w:r>
-      <w:r>
-        <w:rPr>
-          <w:i/>
-          <w:iCs/>
-        </w:rPr>
-        <w:t xml:space="preserve">prove it is O(n).</w:t>
+          <w:b/>
+          <w:bCs/>
+        </w:rPr>
+        <w:t xml:space="preserve">Overflow-safe midpoint:</w:t>
+      </w:r>
+      <w:r>
+        <w:t xml:space="preserve"> </w:t>
+      </w:r>
+      <w:r>
+        <w:t xml:space="preserve">use</w:t>
+      </w:r>
+      <w:r>
+        <w:t xml:space="preserve"> </w:t>
+      </w:r>
+      <w:r>
+        <w:rPr>
+          <w:rStyle w:val="VerbatimChar"/>
+        </w:rPr>
+        <w:t xml:space="preserve">lo + (hi-lo)/2</w:t>
+      </w:r>
+      <w:r>
+        <w:t xml:space="preserve">, never</w:t>
+      </w:r>
+      <w:r>
+        <w:t xml:space="preserve"> </w:t>
+      </w:r>
+      <w:r>
+        <w:rPr>
+          <w:rStyle w:val="VerbatimChar"/>
+        </w:rPr>
+        <w:t xml:space="preserve">(lo+hi)/2</w:t>
+      </w:r>
+      <w:r>
+        <w:t xml:space="preserve"> </w:t>
+      </w:r>
+      <w:r>
+        <w:t xml:space="preserve">— see the</w:t>
+      </w:r>
+      <w:r>
+        <w:t xml:space="preserve"> </w:t>
+      </w:r>
+      <w:r>
+        <w:t xml:space="preserve">Module 1 overflow note.</w:t>
       </w:r>
     </w:p>
     <w:p>
@@ -12104,26 +12478,82 @@
       </w:pPr>
       <w:r>
         <w:rPr>
-          <w:i/>
-          <w:iCs/>
-        </w:rPr>
-        <w:t xml:space="preserve">Sort colors in one pass.</w:t>
-      </w:r>
-      <w:r>
-        <w:t xml:space="preserve"> </w:t>
-      </w:r>
-      <w:r>
-        <w:t xml:space="preserve">FU:</w:t>
-      </w:r>
-      <w:r>
-        <w:t xml:space="preserve"> </w:t>
-      </w:r>
-      <w:r>
-        <w:rPr>
-          <w:i/>
-          <w:iCs/>
-        </w:rPr>
-        <w:t xml:space="preserve">does it generalise to 4 colors?</w:t>
+          <w:b/>
+          <w:bCs/>
+        </w:rPr>
+        <w:t xml:space="preserve">Beyond exact match:</w:t>
+      </w:r>
+      <w:r>
+        <w:t xml:space="preserve"> </w:t>
+      </w:r>
+      <w:r>
+        <w:t xml:space="preserve">the same halving finds the</w:t>
+      </w:r>
+      <w:r>
+        <w:t xml:space="preserve"> </w:t>
+      </w:r>
+      <w:r>
+        <w:rPr>
+          <w:b/>
+          <w:bCs/>
+        </w:rPr>
+        <w:t xml:space="preserve">first/last</w:t>
+      </w:r>
+      <w:r>
+        <w:t xml:space="preserve"> </w:t>
+      </w:r>
+      <w:r>
+        <w:t xml:space="preserve">occurrence,</w:t>
+      </w:r>
+      <w:r>
+        <w:t xml:space="preserve"> </w:t>
+      </w:r>
+      <w:r>
+        <w:t xml:space="preserve">the</w:t>
+      </w:r>
+      <w:r>
+        <w:t xml:space="preserve"> </w:t>
+      </w:r>
+      <w:r>
+        <w:rPr>
+          <w:b/>
+          <w:bCs/>
+        </w:rPr>
+        <w:t xml:space="preserve">lower/upper bound</w:t>
+      </w:r>
+      <w:r>
+        <w:t xml:space="preserve"> </w:t>
+      </w:r>
+      <w:r>
+        <w:t xml:space="preserve">(first index ≥ / &gt; target), or the answer to</w:t>
+      </w:r>
+      <w:r>
+        <w:t xml:space="preserve"> </w:t>
+      </w:r>
+      <w:r>
+        <w:t xml:space="preserve">“</w:t>
+      </w:r>
+      <w:r>
+        <w:rPr>
+          <w:b/>
+          <w:bCs/>
+        </w:rPr>
+        <w:t xml:space="preserve">binary search on the answer</w:t>
+      </w:r>
+      <w:r>
+        <w:t xml:space="preserve">”</w:t>
+      </w:r>
+      <w:r>
+        <w:t xml:space="preserve"> </w:t>
+      </w:r>
+      <w:r>
+        <w:t xml:space="preserve">problems (e.g. minimum capacity, Koko eating</w:t>
+      </w:r>
+      <w:r>
+        <w:t xml:space="preserve"> </w:t>
+      </w:r>
+      <w:r>
+        <w:t xml:space="preserve">bananas LC 875). Full treatment in the Searching module.</w:t>
       </w:r>
     </w:p>
     <w:p>
@@ -12136,36 +12566,72 @@
       </w:pPr>
       <w:r>
         <w:rPr>
-          <w:i/>
-          <w:iCs/>
-        </w:rPr>
-        <w:t xml:space="preserve">Max subarray; the all-negative case?</w:t>
-      </w:r>
-      <w:r>
-        <w:t xml:space="preserve"> </w:t>
-      </w:r>
-      <w:r>
-        <w:t xml:space="preserve">FU:</w:t>
-      </w:r>
-      <w:r>
-        <w:t xml:space="preserve"> </w:t>
-      </w:r>
-      <w:r>
-        <w:rPr>
-          <w:i/>
-          <w:iCs/>
-        </w:rPr>
-        <w:t xml:space="preserve">also return the indices.</w:t>
-      </w:r>
-    </w:p>
-    <w:bookmarkEnd w:id="148"/>
-    <w:bookmarkStart w:id="149" w:name="module-2-gate-sebi-rbi-isro-perspective"/>
-    <w:p>
-      <w:pPr>
-        <w:pStyle w:val="Heading2"/>
-      </w:pPr>
-      <w:r>
-        <w:t xml:space="preserve">Module 2 — GATE / SEBI / RBI / ISRO Perspective</w:t>
+          <w:b/>
+          <w:bCs/>
+        </w:rPr>
+        <w:t xml:space="preserve">Loop invariant:</w:t>
+      </w:r>
+      <w:r>
+        <w:t xml:space="preserve"> </w:t>
+      </w:r>
+      <w:r>
+        <w:t xml:space="preserve">the answer, if present, always stays inside</w:t>
+      </w:r>
+      <w:r>
+        <w:t xml:space="preserve"> </w:t>
+      </w:r>
+      <w:r>
+        <w:rPr>
+          <w:rStyle w:val="VerbatimChar"/>
+        </w:rPr>
+        <w:t xml:space="preserve">[lo, hi]</w:t>
+      </w:r>
+      <w:r>
+        <w:t xml:space="preserve">. Get</w:t>
+      </w:r>
+      <w:r>
+        <w:t xml:space="preserve"> </w:t>
+      </w:r>
+      <w:r>
+        <w:t xml:space="preserve">the boundary updates right and termination follows.</w:t>
+      </w:r>
+    </w:p>
+    <w:p>
+      <w:pPr>
+        <w:pStyle w:val="Compact"/>
+        <w:numPr>
+          <w:ilvl w:val="0"/>
+          <w:numId w:val="1048"/>
+        </w:numPr>
+      </w:pPr>
+      <w:r>
+        <w:rPr>
+          <w:b/>
+          <w:bCs/>
+        </w:rPr>
+        <w:t xml:space="preserve">Problems:</w:t>
+      </w:r>
+      <w:r>
+        <w:t xml:space="preserve"> </w:t>
+      </w:r>
+      <w:r>
+        <w:t xml:space="preserve">Binary Search (LC 704); Search Insert Position (LC 35); Find</w:t>
+      </w:r>
+      <w:r>
+        <w:t xml:space="preserve"> </w:t>
+      </w:r>
+      <w:r>
+        <w:t xml:space="preserve">First and Last Position (LC 34); Search in Rotated Sorted Array (LC 33).</w:t>
+      </w:r>
+    </w:p>
+    <w:bookmarkEnd w:id="151"/>
+    <w:bookmarkStart w:id="152" w:name="mcqs-8"/>
+    <w:p>
+      <w:pPr>
+        <w:pStyle w:val="Heading3"/>
+      </w:pPr>
+      <w:r>
+        <w:t xml:space="preserve">MCQs</w:t>
       </w:r>
     </w:p>
     <w:p>
@@ -12178,37 +12644,185 @@
       </w:pPr>
       <w:r>
         <w:rPr>
-          <w:b/>
-          <w:bCs/>
-        </w:rPr>
-        <w:t xml:space="preserve">Common:</w:t>
-      </w:r>
-      <w:r>
-        <w:t xml:space="preserve"> </w:t>
-      </w:r>
-      <w:r>
-        <w:t xml:space="preserve">address calculation (</w:t>
-      </w:r>
-      <w:r>
-        <w:rPr>
-          <w:rStyle w:val="VerbatimChar"/>
-        </w:rPr>
-        <w:t xml:space="preserve">base + i*size</w:t>
-      </w:r>
-      <w:r>
-        <w:t xml:space="preserve">, the 2D row-major formula),</w:t>
-      </w:r>
-      <w:r>
-        <w:t xml:space="preserve"> </w:t>
-      </w:r>
-      <w:r>
-        <w:t xml:space="preserve">amortised analysis of dynamic arrays, time complexity of insert/delete/search,</w:t>
-      </w:r>
-      <w:r>
-        <w:t xml:space="preserve"> </w:t>
-      </w:r>
-      <w:r>
-        <w:t xml:space="preserve">prefix-sum reasoning. The 2D array address formula is a GATE favourite.</w:t>
+          <w:rStyle w:val="VerbatimChar"/>
+        </w:rPr>
+        <w:t xml:space="preserve">[1,2,3]</w:t>
+      </w:r>
+      <w:r>
+        <w:t xml:space="preserve"> </w:t>
+      </w:r>
+      <w:r>
+        <w:t xml:space="preserve">— subarray or subsequence is</w:t>
+      </w:r>
+      <w:r>
+        <w:t xml:space="preserve"> </w:t>
+      </w:r>
+      <w:r>
+        <w:rPr>
+          <w:rStyle w:val="VerbatimChar"/>
+        </w:rPr>
+        <w:t xml:space="preserve">[1,3]</w:t>
+      </w:r>
+      <w:r>
+        <w:t xml:space="preserve">? →</w:t>
+      </w:r>
+      <w:r>
+        <w:t xml:space="preserve"> </w:t>
+      </w:r>
+      <w:r>
+        <w:rPr>
+          <w:b/>
+          <w:bCs/>
+        </w:rPr>
+        <w:t xml:space="preserve">subsequence</w:t>
+      </w:r>
+      <w:r>
+        <w:t xml:space="preserve"> </w:t>
+      </w:r>
+      <w:r>
+        <w:t xml:space="preserve">(not</w:t>
+      </w:r>
+      <w:r>
+        <w:t xml:space="preserve"> </w:t>
+      </w:r>
+      <w:r>
+        <w:t xml:space="preserve">contiguous).</w:t>
+      </w:r>
+    </w:p>
+    <w:p>
+      <w:pPr>
+        <w:pStyle w:val="Compact"/>
+        <w:numPr>
+          <w:ilvl w:val="0"/>
+          <w:numId w:val="1049"/>
+        </w:numPr>
+      </w:pPr>
+      <w:r>
+        <w:t xml:space="preserve">Rotate array by k in O(1) space? →</w:t>
+      </w:r>
+      <w:r>
+        <w:t xml:space="preserve"> </w:t>
+      </w:r>
+      <w:r>
+        <w:rPr>
+          <w:b/>
+          <w:bCs/>
+        </w:rPr>
+        <w:t xml:space="preserve">three reversals</w:t>
+      </w:r>
+      <w:r>
+        <w:t xml:space="preserve">; remember</w:t>
+      </w:r>
+      <w:r>
+        <w:t xml:space="preserve"> </w:t>
+      </w:r>
+      <w:r>
+        <w:rPr>
+          <w:rStyle w:val="VerbatimChar"/>
+        </w:rPr>
+        <w:t xml:space="preserve">k % n</w:t>
+      </w:r>
+      <w:r>
+        <w:t xml:space="preserve">.</w:t>
+      </w:r>
+    </w:p>
+    <w:p>
+      <w:pPr>
+        <w:pStyle w:val="Compact"/>
+        <w:numPr>
+          <w:ilvl w:val="0"/>
+          <w:numId w:val="1049"/>
+        </w:numPr>
+      </w:pPr>
+      <w:r>
+        <w:t xml:space="preserve">Next permutation of</w:t>
+      </w:r>
+      <w:r>
+        <w:t xml:space="preserve"> </w:t>
+      </w:r>
+      <w:r>
+        <w:rPr>
+          <w:rStyle w:val="VerbatimChar"/>
+        </w:rPr>
+        <w:t xml:space="preserve">[1,3,2]</w:t>
+      </w:r>
+      <w:r>
+        <w:t xml:space="preserve">? →</w:t>
+      </w:r>
+      <w:r>
+        <w:t xml:space="preserve"> </w:t>
+      </w:r>
+      <w:r>
+        <w:rPr>
+          <w:b/>
+          <w:bCs/>
+        </w:rPr>
+        <w:t xml:space="preserve">[2,1,3]</w:t>
+      </w:r>
+      <w:r>
+        <w:t xml:space="preserve">.</w:t>
+      </w:r>
+    </w:p>
+    <w:p>
+      <w:pPr>
+        <w:pStyle w:val="Compact"/>
+        <w:numPr>
+          <w:ilvl w:val="0"/>
+          <w:numId w:val="1049"/>
+        </w:numPr>
+      </w:pPr>
+      <w:r>
+        <w:t xml:space="preserve">Binary search needs the array to be? →</w:t>
+      </w:r>
+      <w:r>
+        <w:t xml:space="preserve"> </w:t>
+      </w:r>
+      <w:r>
+        <w:rPr>
+          <w:b/>
+          <w:bCs/>
+        </w:rPr>
+        <w:t xml:space="preserve">sorted</w:t>
+      </w:r>
+      <w:r>
+        <w:t xml:space="preserve">; time</w:t>
+      </w:r>
+      <w:r>
+        <w:t xml:space="preserve"> </w:t>
+      </w:r>
+      <w:r>
+        <w:rPr>
+          <w:b/>
+          <w:bCs/>
+        </w:rPr>
+        <w:t xml:space="preserve">O(log n)</w:t>
+      </w:r>
+      <w:r>
+        <w:t xml:space="preserve">.</w:t>
+      </w:r>
+    </w:p>
+    <w:p>
+      <w:pPr>
+        <w:pStyle w:val="Compact"/>
+        <w:numPr>
+          <w:ilvl w:val="0"/>
+          <w:numId w:val="1049"/>
+        </w:numPr>
+      </w:pPr>
+      <w:r>
+        <w:t xml:space="preserve">Safe midpoint in binary search? →</w:t>
+      </w:r>
+      <w:r>
+        <w:t xml:space="preserve"> </w:t>
+      </w:r>
+      <w:r>
+        <w:rPr>
+          <w:rStyle w:val="VerbatimChar"/>
+        </w:rPr>
+        <w:t xml:space="preserve">lo + (hi-lo)/2</w:t>
+      </w:r>
+      <w:r>
+        <w:t xml:space="preserve">.</w:t>
       </w:r>
     </w:p>
     <w:p>
@@ -12218,34 +12832,1813 @@
         </w:pict>
       </w:r>
     </w:p>
-    <w:p>
-      <w:pPr>
-        <w:pStyle w:val="FirstParagraph"/>
+    <w:bookmarkEnd w:id="152"/>
+    <w:bookmarkEnd w:id="153"/>
+    <w:bookmarkStart w:id="154" w:name="module-2-concept-review-one-page"/>
+    <w:p>
+      <w:pPr>
+        <w:pStyle w:val="Heading2"/>
+      </w:pPr>
+      <w:r>
+        <w:t xml:space="preserve">Module 2 — Concept Review (one page)</w:t>
+      </w:r>
+    </w:p>
+    <w:p>
+      <w:pPr>
+        <w:pStyle w:val="Compact"/>
+        <w:numPr>
+          <w:ilvl w:val="0"/>
+          <w:numId w:val="1050"/>
+        </w:numPr>
+      </w:pPr>
+      <w:r>
+        <w:rPr>
+          <w:b/>
+          <w:bCs/>
+        </w:rPr>
+        <w:t xml:space="preserve">Array</w:t>
+      </w:r>
+      <w:r>
+        <w:t xml:space="preserve"> </w:t>
+      </w:r>
+      <w:r>
+        <w:t xml:space="preserve">= contiguous block; access O(1) via</w:t>
+      </w:r>
+      <w:r>
+        <w:t xml:space="preserve"> </w:t>
+      </w:r>
+      <w:r>
+        <w:rPr>
+          <w:rStyle w:val="VerbatimChar"/>
+        </w:rPr>
+        <w:t xml:space="preserve">base + i*size</w:t>
+      </w:r>
+      <w:r>
+        <w:t xml:space="preserve">; cache-friendly.</w:t>
+      </w:r>
+    </w:p>
+    <w:p>
+      <w:pPr>
+        <w:pStyle w:val="Compact"/>
+        <w:numPr>
+          <w:ilvl w:val="0"/>
+          <w:numId w:val="1050"/>
+        </w:numPr>
+      </w:pPr>
+      <w:r>
+        <w:rPr>
+          <w:b/>
+          <w:bCs/>
+        </w:rPr>
+        <w:t xml:space="preserve">Dynamic array</w:t>
+      </w:r>
+      <w:r>
+        <w:t xml:space="preserve"> </w:t>
+      </w:r>
+      <w:r>
+        <w:t xml:space="preserve">doubles when full → append O(1) amortised (proof:</w:t>
+      </w:r>
+      <w:r>
+        <w:t xml:space="preserve"> </w:t>
+      </w:r>
+      <w:r>
+        <w:t xml:space="preserve">1+2+4+…+n = O(n) total).</w:t>
+      </w:r>
+    </w:p>
+    <w:p>
+      <w:pPr>
+        <w:pStyle w:val="Compact"/>
+        <w:numPr>
+          <w:ilvl w:val="0"/>
+          <w:numId w:val="1050"/>
+        </w:numPr>
+      </w:pPr>
+      <w:r>
+        <w:rPr>
+          <w:b/>
+          <w:bCs/>
+        </w:rPr>
+        <w:t xml:space="preserve">Prefix sum</w:t>
+      </w:r>
+      <w:r>
+        <w:t xml:space="preserve"> </w:t>
+      </w:r>
+      <w:r>
+        <w:t xml:space="preserve">→ range</w:t>
+      </w:r>
+      <w:r>
+        <w:t xml:space="preserve"> </w:t>
+      </w:r>
+      <w:r>
+        <w:rPr>
+          <w:b/>
+          <w:bCs/>
+        </w:rPr>
+        <w:t xml:space="preserve">query</w:t>
+      </w:r>
+      <w:r>
+        <w:t xml:space="preserve"> </w:t>
+      </w:r>
+      <w:r>
+        <w:t xml:space="preserve">O(1) (1D &amp; 2D).</w:t>
+      </w:r>
+      <w:r>
+        <w:t xml:space="preserve"> </w:t>
+      </w:r>
+      <w:r>
+        <w:rPr>
+          <w:b/>
+          <w:bCs/>
+        </w:rPr>
+        <w:t xml:space="preserve">Difference array</w:t>
+      </w:r>
+      <w:r>
+        <w:t xml:space="preserve"> </w:t>
+      </w:r>
+      <w:r>
+        <w:t xml:space="preserve">→ range</w:t>
+      </w:r>
+      <w:r>
+        <w:t xml:space="preserve"> </w:t>
+      </w:r>
+      <w:r>
+        <w:rPr>
+          <w:b/>
+          <w:bCs/>
+        </w:rPr>
+        <w:t xml:space="preserve">update</w:t>
+      </w:r>
+      <w:r>
+        <w:t xml:space="preserve"> </w:t>
+      </w:r>
+      <w:r>
+        <w:t xml:space="preserve">O(1).</w:t>
+      </w:r>
+    </w:p>
+    <w:p>
+      <w:pPr>
+        <w:pStyle w:val="Compact"/>
+        <w:numPr>
+          <w:ilvl w:val="0"/>
+          <w:numId w:val="1050"/>
+        </w:numPr>
+      </w:pPr>
+      <w:r>
+        <w:rPr>
+          <w:b/>
+          <w:bCs/>
+        </w:rPr>
+        <w:t xml:space="preserve">Two pointers</w:t>
+      </w:r>
+      <w:r>
+        <w:t xml:space="preserve"> </w:t>
+      </w:r>
+      <w:r>
+        <w:t xml:space="preserve">→ O(n²)→O(n) on sorted/monotonic input (pair sum, palindrome,</w:t>
+      </w:r>
+      <w:r>
+        <w:t xml:space="preserve"> </w:t>
+      </w:r>
+      <w:r>
+        <w:t xml:space="preserve">3Sum).</w:t>
+      </w:r>
+    </w:p>
+    <w:p>
+      <w:pPr>
+        <w:pStyle w:val="Compact"/>
+        <w:numPr>
+          <w:ilvl w:val="0"/>
+          <w:numId w:val="1050"/>
+        </w:numPr>
+      </w:pPr>
+      <w:r>
+        <w:rPr>
+          <w:b/>
+          <w:bCs/>
+        </w:rPr>
+        <w:t xml:space="preserve">Sliding window</w:t>
+      </w:r>
+      <w:r>
+        <w:t xml:space="preserve"> </w:t>
+      </w:r>
+      <w:r>
+        <w:t xml:space="preserve">→ contiguous subarray/substring, O(n) (each element in/out</w:t>
+      </w:r>
+      <w:r>
+        <w:t xml:space="preserve"> </w:t>
+      </w:r>
+      <w:r>
+        <w:t xml:space="preserve">once); fixed vs variable.</w:t>
+      </w:r>
+    </w:p>
+    <w:p>
+      <w:pPr>
+        <w:pStyle w:val="Compact"/>
+        <w:numPr>
+          <w:ilvl w:val="0"/>
+          <w:numId w:val="1050"/>
+        </w:numPr>
+      </w:pPr>
+      <w:r>
+        <w:rPr>
+          <w:b/>
+          <w:bCs/>
+        </w:rPr>
+        <w:t xml:space="preserve">Kadane</w:t>
+      </w:r>
+      <w:r>
+        <w:t xml:space="preserve"> </w:t>
+      </w:r>
+      <w:r>
+        <w:t xml:space="preserve">→ max subarray O(n)/O(1); init</w:t>
+      </w:r>
+      <w:r>
+        <w:t xml:space="preserve"> </w:t>
+      </w:r>
+      <w:r>
+        <w:rPr>
+          <w:rStyle w:val="VerbatimChar"/>
+        </w:rPr>
+        <w:t xml:space="preserve">best=a[0]</w:t>
+      </w:r>
+      <w:r>
+        <w:t xml:space="preserve"> </w:t>
+      </w:r>
+      <w:r>
+        <w:t xml:space="preserve">(all-negative trap).</w:t>
+      </w:r>
+    </w:p>
+    <w:p>
+      <w:pPr>
+        <w:pStyle w:val="Compact"/>
+        <w:numPr>
+          <w:ilvl w:val="0"/>
+          <w:numId w:val="1050"/>
+        </w:numPr>
+      </w:pPr>
+      <w:r>
+        <w:rPr>
+          <w:b/>
+          <w:bCs/>
+        </w:rPr>
+        <w:t xml:space="preserve">Dutch flag</w:t>
+      </w:r>
+      <w:r>
+        <w:t xml:space="preserve"> </w:t>
+      </w:r>
+      <w:r>
+        <w:t xml:space="preserve">→ 3-way partition, one pass, O(1) space.</w:t>
+      </w:r>
+    </w:p>
+    <w:p>
+      <w:pPr>
+        <w:pStyle w:val="Compact"/>
+        <w:numPr>
+          <w:ilvl w:val="0"/>
+          <w:numId w:val="1050"/>
+        </w:numPr>
+      </w:pPr>
+      <w:r>
+        <w:rPr>
+          <w:b/>
+          <w:bCs/>
+        </w:rPr>
+        <w:t xml:space="preserve">Matrix</w:t>
+      </w:r>
+      <w:r>
+        <w:t xml:space="preserve"> </w:t>
+      </w:r>
+      <w:r>
+        <w:t xml:space="preserve">→ rotate = transpose+reverse; spiral; sorted search from a corner.</w:t>
+      </w:r>
+    </w:p>
+    <w:p>
+      <w:pPr>
+        <w:pStyle w:val="Compact"/>
+        <w:numPr>
+          <w:ilvl w:val="0"/>
+          <w:numId w:val="1050"/>
+        </w:numPr>
+      </w:pPr>
+      <w:r>
+        <w:rPr>
+          <w:b/>
+          <w:bCs/>
+        </w:rPr>
+        <w:t xml:space="preserve">Moore’s voting</w:t>
+      </w:r>
+      <w:r>
+        <w:t xml:space="preserve"> </w:t>
+      </w:r>
+      <w:r>
+        <w:t xml:space="preserve">→ majority (&gt;n/2) in O(n)/O(1) (tug of war).</w:t>
+      </w:r>
+    </w:p>
+    <w:p>
+      <w:pPr>
+        <w:pStyle w:val="Compact"/>
+        <w:numPr>
+          <w:ilvl w:val="0"/>
+          <w:numId w:val="1050"/>
+        </w:numPr>
+      </w:pPr>
+      <w:r>
+        <w:rPr>
+          <w:b/>
+          <w:bCs/>
+        </w:rPr>
+        <w:t xml:space="preserve">Merge intervals</w:t>
+      </w:r>
+      <w:r>
+        <w:t xml:space="preserve"> </w:t>
+      </w:r>
+      <w:r>
+        <w:t xml:space="preserve">→ sort by start, then sweep merging overlaps.</w:t>
+      </w:r>
+    </w:p>
+    <w:p>
+      <w:pPr>
+        <w:pStyle w:val="Compact"/>
+        <w:numPr>
+          <w:ilvl w:val="0"/>
+          <w:numId w:val="1050"/>
+        </w:numPr>
+      </w:pPr>
+      <w:r>
+        <w:rPr>
+          <w:b/>
+          <w:bCs/>
+        </w:rPr>
+        <w:t xml:space="preserve">Cyclic sort</w:t>
+      </w:r>
+      <w:r>
+        <w:t xml:space="preserve"> </w:t>
+      </w:r>
+      <w:r>
+        <w:t xml:space="preserve">→ values in 1..n → put each at index value−1 (find missing/dup).</w:t>
+      </w:r>
+    </w:p>
+    <w:p>
+      <w:pPr>
+        <w:pStyle w:val="Compact"/>
+        <w:numPr>
+          <w:ilvl w:val="0"/>
+          <w:numId w:val="1050"/>
+        </w:numPr>
+      </w:pPr>
+      <w:r>
+        <w:rPr>
+          <w:b/>
+          <w:bCs/>
+        </w:rPr>
+        <w:t xml:space="preserve">Subarray</w:t>
+      </w:r>
+      <w:r>
+        <w:t xml:space="preserve"> </w:t>
+      </w:r>
+      <w:r>
+        <w:t xml:space="preserve">(contiguous) vs</w:t>
+      </w:r>
+      <w:r>
+        <w:t xml:space="preserve"> </w:t>
+      </w:r>
+      <w:r>
+        <w:rPr>
+          <w:b/>
+          <w:bCs/>
+        </w:rPr>
+        <w:t xml:space="preserve">subsequence</w:t>
+      </w:r>
+      <w:r>
+        <w:t xml:space="preserve"> </w:t>
+      </w:r>
+      <w:r>
+        <w:t xml:space="preserve">(order kept, gaps allowed) vs</w:t>
+      </w:r>
+      <w:r>
+        <w:t xml:space="preserve"> </w:t>
+      </w:r>
+      <w:r>
+        <w:rPr>
+          <w:b/>
+          <w:bCs/>
+        </w:rPr>
+        <w:t xml:space="preserve">subset</w:t>
+      </w:r>
+      <w:r>
+        <w:t xml:space="preserve"> </w:t>
+      </w:r>
+      <w:r>
+        <w:t xml:space="preserve">(no order):</w:t>
+      </w:r>
+      <w:r>
+        <w:t xml:space="preserve"> </w:t>
+      </w:r>
+      <w:r>
+        <w:rPr>
+          <w:rStyle w:val="VerbatimChar"/>
+        </w:rPr>
+        <w:t xml:space="preserve">n(n+1)/2</w:t>
+      </w:r>
+      <w:r>
+        <w:t xml:space="preserve"> </w:t>
+      </w:r>
+      <w:r>
+        <w:t xml:space="preserve">subarrays but</w:t>
+      </w:r>
+      <w:r>
+        <w:t xml:space="preserve"> </w:t>
+      </w:r>
+      <w:r>
+        <w:rPr>
+          <w:rStyle w:val="VerbatimChar"/>
+        </w:rPr>
+        <w:t xml:space="preserve">2ⁿ</w:t>
+      </w:r>
+      <w:r>
+        <w:t xml:space="preserve"> </w:t>
+      </w:r>
+      <w:r>
+        <w:t xml:space="preserve">subsequences.</w:t>
+      </w:r>
+    </w:p>
+    <w:p>
+      <w:pPr>
+        <w:pStyle w:val="Compact"/>
+        <w:numPr>
+          <w:ilvl w:val="0"/>
+          <w:numId w:val="1050"/>
+        </w:numPr>
+      </w:pPr>
+      <w:r>
+        <w:rPr>
+          <w:b/>
+          <w:bCs/>
+        </w:rPr>
+        <w:t xml:space="preserve">Rotation</w:t>
+      </w:r>
+      <w:r>
+        <w:t xml:space="preserve"> </w:t>
+      </w:r>
+      <w:r>
+        <w:t xml:space="preserve">→ three reversals, O(1) space (remember</w:t>
+      </w:r>
+      <w:r>
+        <w:t xml:space="preserve"> </w:t>
+      </w:r>
+      <w:r>
+        <w:rPr>
+          <w:rStyle w:val="VerbatimChar"/>
+        </w:rPr>
+        <w:t xml:space="preserve">k % n</w:t>
+      </w:r>
+      <w:r>
+        <w:t xml:space="preserve">).</w:t>
+      </w:r>
+    </w:p>
+    <w:p>
+      <w:pPr>
+        <w:pStyle w:val="Compact"/>
+        <w:numPr>
+          <w:ilvl w:val="0"/>
+          <w:numId w:val="1050"/>
+        </w:numPr>
+      </w:pPr>
+      <w:r>
+        <w:rPr>
+          <w:b/>
+          <w:bCs/>
+        </w:rPr>
+        <w:t xml:space="preserve">Next permutation</w:t>
+      </w:r>
+      <w:r>
+        <w:t xml:space="preserve"> </w:t>
+      </w:r>
+      <w:r>
+        <w:t xml:space="preserve">→ find the dip from the right, swap, reverse the suffix.</w:t>
+      </w:r>
+    </w:p>
+    <w:p>
+      <w:pPr>
+        <w:pStyle w:val="Compact"/>
+        <w:numPr>
+          <w:ilvl w:val="0"/>
+          <w:numId w:val="1050"/>
+        </w:numPr>
+      </w:pPr>
+      <w:r>
+        <w:rPr>
+          <w:b/>
+          <w:bCs/>
+        </w:rPr>
+        <w:t xml:space="preserve">Binary search</w:t>
+      </w:r>
+      <w:r>
+        <w:t xml:space="preserve"> </w:t>
+      </w:r>
+      <w:r>
+        <w:t xml:space="preserve">→ sorted array, O(log n); overflow-safe midpoint.</w:t>
+      </w:r>
+    </w:p>
+    <w:bookmarkEnd w:id="154"/>
+    <w:bookmarkStart w:id="155" w:name="module-2-flash-cards"/>
+    <w:p>
+      <w:pPr>
+        <w:pStyle w:val="Heading2"/>
+      </w:pPr>
+      <w:r>
+        <w:t xml:space="preserve">Module 2 — Flash Cards</w:t>
+      </w:r>
+    </w:p>
+    <w:p>
+      <w:pPr>
+        <w:pStyle w:val="Compact"/>
+        <w:numPr>
+          <w:ilvl w:val="0"/>
+          <w:numId w:val="1051"/>
+        </w:numPr>
+      </w:pPr>
+      <w:r>
+        <w:t xml:space="preserve">Q: Append amortised cost &amp; why?</w:t>
+      </w:r>
+      <w:r>
+        <w:t xml:space="preserve"> </w:t>
+      </w:r>
+      <w:r>
+        <w:rPr>
+          <w:b/>
+          <w:bCs/>
+        </w:rPr>
+        <w:t xml:space="preserve">A: O(1); doubling → 1+2+…+n = 2n.</w:t>
+      </w:r>
+    </w:p>
+    <w:p>
+      <w:pPr>
+        <w:pStyle w:val="Compact"/>
+        <w:numPr>
+          <w:ilvl w:val="0"/>
+          <w:numId w:val="1051"/>
+        </w:numPr>
+      </w:pPr>
+      <w:r>
+        <w:t xml:space="preserve">Q: Range sum O(1)?</w:t>
+      </w:r>
+      <w:r>
+        <w:t xml:space="preserve"> </w:t>
+      </w:r>
+      <w:r>
+        <w:rPr>
+          <w:b/>
+          <w:bCs/>
+        </w:rPr>
+        <w:t xml:space="preserve">A: prefix sum,</w:t>
+      </w:r>
+      <w:r>
+        <w:rPr>
+          <w:b/>
+          <w:bCs/>
+        </w:rPr>
+        <w:t xml:space="preserve"> </w:t>
+      </w:r>
+      <w:r>
+        <w:rPr>
+          <w:rStyle w:val="VerbatimChar"/>
+          <w:b/>
+          <w:bCs/>
+        </w:rPr>
+        <w:t xml:space="preserve">pre[R+1]-pre[L]</w:t>
+      </w:r>
+      <w:r>
+        <w:rPr>
+          <w:b/>
+          <w:bCs/>
+        </w:rPr>
+        <w:t xml:space="preserve">.</w:t>
+      </w:r>
+    </w:p>
+    <w:p>
+      <w:pPr>
+        <w:pStyle w:val="Compact"/>
+        <w:numPr>
+          <w:ilvl w:val="0"/>
+          <w:numId w:val="1051"/>
+        </w:numPr>
+      </w:pPr>
+      <w:r>
+        <w:t xml:space="preserve">Q: Range update O(1)?</w:t>
+      </w:r>
+      <w:r>
+        <w:t xml:space="preserve"> </w:t>
+      </w:r>
+      <w:r>
+        <w:rPr>
+          <w:b/>
+          <w:bCs/>
+        </w:rPr>
+        <w:t xml:space="preserve">A: difference array.</w:t>
+      </w:r>
+    </w:p>
+    <w:p>
+      <w:pPr>
+        <w:pStyle w:val="Compact"/>
+        <w:numPr>
+          <w:ilvl w:val="0"/>
+          <w:numId w:val="1051"/>
+        </w:numPr>
+      </w:pPr>
+      <w:r>
+        <w:t xml:space="preserve">Q: Two pointers needs the array to be?</w:t>
+      </w:r>
+      <w:r>
+        <w:t xml:space="preserve"> </w:t>
+      </w:r>
+      <w:r>
+        <w:rPr>
+          <w:b/>
+          <w:bCs/>
+        </w:rPr>
+        <w:t xml:space="preserve">A: sorted/monotonic.</w:t>
+      </w:r>
+    </w:p>
+    <w:p>
+      <w:pPr>
+        <w:pStyle w:val="Compact"/>
+        <w:numPr>
+          <w:ilvl w:val="0"/>
+          <w:numId w:val="1051"/>
+        </w:numPr>
+      </w:pPr>
+      <w:r>
+        <w:t xml:space="preserve">Q: Sliding window — why O(n)?</w:t>
+      </w:r>
+      <w:r>
+        <w:t xml:space="preserve"> </w:t>
+      </w:r>
+      <w:r>
+        <w:rPr>
+          <w:b/>
+          <w:bCs/>
+        </w:rPr>
+        <w:t xml:space="preserve">A: each element added &amp; removed once.</w:t>
+      </w:r>
+    </w:p>
+    <w:p>
+      <w:pPr>
+        <w:pStyle w:val="Compact"/>
+        <w:numPr>
+          <w:ilvl w:val="0"/>
+          <w:numId w:val="1051"/>
+        </w:numPr>
+      </w:pPr>
+      <w:r>
+        <w:t xml:space="preserve">Q: Kadane all-negative bug?</w:t>
+      </w:r>
+      <w:r>
+        <w:t xml:space="preserve"> </w:t>
+      </w:r>
+      <w:r>
+        <w:rPr>
+          <w:b/>
+          <w:bCs/>
+        </w:rPr>
+        <w:t xml:space="preserve">A: init best=a[0], not 0.</w:t>
+      </w:r>
+    </w:p>
+    <w:p>
+      <w:pPr>
+        <w:pStyle w:val="Compact"/>
+        <w:numPr>
+          <w:ilvl w:val="0"/>
+          <w:numId w:val="1051"/>
+        </w:numPr>
+      </w:pPr>
+      <w:r>
+        <w:t xml:space="preserve">Q: Sort 0/1/2 in one pass?</w:t>
+      </w:r>
+      <w:r>
+        <w:t xml:space="preserve"> </w:t>
+      </w:r>
+      <w:r>
+        <w:rPr>
+          <w:b/>
+          <w:bCs/>
+        </w:rPr>
+        <w:t xml:space="preserve">A: Dutch national flag (3 pointers).</w:t>
+      </w:r>
+    </w:p>
+    <w:p>
+      <w:pPr>
+        <w:pStyle w:val="Compact"/>
+        <w:numPr>
+          <w:ilvl w:val="0"/>
+          <w:numId w:val="1051"/>
+        </w:numPr>
+      </w:pPr>
+      <w:r>
+        <w:t xml:space="preserve">Q: Rotate 90° CW?</w:t>
+      </w:r>
+      <w:r>
+        <w:t xml:space="preserve"> </w:t>
+      </w:r>
+      <w:r>
+        <w:rPr>
+          <w:b/>
+          <w:bCs/>
+        </w:rPr>
+        <w:t xml:space="preserve">A: transpose + reverse rows.</w:t>
+      </w:r>
+    </w:p>
+    <w:p>
+      <w:pPr>
+        <w:pStyle w:val="Compact"/>
+        <w:numPr>
+          <w:ilvl w:val="0"/>
+          <w:numId w:val="1051"/>
+        </w:numPr>
+      </w:pPr>
+      <w:r>
+        <w:t xml:space="preserve">Q: Majority element (&gt;n/2) in O(1) space?</w:t>
+      </w:r>
+      <w:r>
+        <w:t xml:space="preserve"> </w:t>
+      </w:r>
+      <w:r>
+        <w:rPr>
+          <w:b/>
+          <w:bCs/>
+        </w:rPr>
+        <w:t xml:space="preserve">A: Moore’s voting (tug of war).</w:t>
+      </w:r>
+    </w:p>
+    <w:p>
+      <w:pPr>
+        <w:pStyle w:val="Compact"/>
+        <w:numPr>
+          <w:ilvl w:val="0"/>
+          <w:numId w:val="1051"/>
+        </w:numPr>
+      </w:pPr>
+      <w:r>
+        <w:t xml:space="preserve">Q: Merge overlapping intervals?</w:t>
+      </w:r>
+      <w:r>
+        <w:t xml:space="preserve"> </w:t>
+      </w:r>
+      <w:r>
+        <w:rPr>
+          <w:b/>
+          <w:bCs/>
+        </w:rPr>
+        <w:t xml:space="preserve">A: sort by start, sweep; overlap if next.start ≤ cur.end.</w:t>
+      </w:r>
+    </w:p>
+    <w:p>
+      <w:pPr>
+        <w:pStyle w:val="Compact"/>
+        <w:numPr>
+          <w:ilvl w:val="0"/>
+          <w:numId w:val="1051"/>
+        </w:numPr>
+      </w:pPr>
+      <w:r>
+        <w:t xml:space="preserve">Q: Values are 1..n, find missing/duplicate in O(1) space?</w:t>
+      </w:r>
+      <w:r>
+        <w:t xml:space="preserve"> </w:t>
+      </w:r>
+      <w:r>
+        <w:rPr>
+          <w:b/>
+          <w:bCs/>
+        </w:rPr>
+        <w:t xml:space="preserve">A: cyclic sort.</w:t>
+      </w:r>
+    </w:p>
+    <w:p>
+      <w:pPr>
+        <w:pStyle w:val="Compact"/>
+        <w:numPr>
+          <w:ilvl w:val="0"/>
+          <w:numId w:val="1051"/>
+        </w:numPr>
+      </w:pPr>
+      <w:r>
+        <w:t xml:space="preserve">Q: Subarray vs subsequence?</w:t>
+      </w:r>
+      <w:r>
+        <w:t xml:space="preserve"> </w:t>
+      </w:r>
+      <w:r>
+        <w:rPr>
+          <w:b/>
+          <w:bCs/>
+        </w:rPr>
+        <w:t xml:space="preserve">A: subarray = contiguous; subsequence = order kept, gaps ok.</w:t>
+      </w:r>
+    </w:p>
+    <w:p>
+      <w:pPr>
+        <w:pStyle w:val="Compact"/>
+        <w:numPr>
+          <w:ilvl w:val="0"/>
+          <w:numId w:val="1051"/>
+        </w:numPr>
+      </w:pPr>
+      <w:r>
+        <w:t xml:space="preserve">Q: Rotate array by k, O(1) space?</w:t>
+      </w:r>
+      <w:r>
+        <w:t xml:space="preserve"> </w:t>
+      </w:r>
+      <w:r>
+        <w:rPr>
+          <w:b/>
+          <w:bCs/>
+        </w:rPr>
+        <w:t xml:space="preserve">A: three reversals (and k %= n first).</w:t>
+      </w:r>
+    </w:p>
+    <w:p>
+      <w:pPr>
+        <w:pStyle w:val="Compact"/>
+        <w:numPr>
+          <w:ilvl w:val="0"/>
+          <w:numId w:val="1051"/>
+        </w:numPr>
+      </w:pPr>
+      <w:r>
+        <w:t xml:space="preserve">Q: Next permutation steps?</w:t>
+      </w:r>
+      <w:r>
+        <w:t xml:space="preserve"> </w:t>
+      </w:r>
+      <w:r>
+        <w:rPr>
+          <w:b/>
+          <w:bCs/>
+        </w:rPr>
+        <w:t xml:space="preserve">A: find dip from right, swap, reverse suffix.</w:t>
+      </w:r>
+    </w:p>
+    <w:p>
+      <w:pPr>
+        <w:pStyle w:val="Compact"/>
+        <w:numPr>
+          <w:ilvl w:val="0"/>
+          <w:numId w:val="1051"/>
+        </w:numPr>
+      </w:pPr>
+      <w:r>
+        <w:t xml:space="preserve">Q: Binary search needs / gives?</w:t>
+      </w:r>
+      <w:r>
+        <w:t xml:space="preserve"> </w:t>
+      </w:r>
+      <w:r>
+        <w:rPr>
+          <w:b/>
+          <w:bCs/>
+        </w:rPr>
+        <w:t xml:space="preserve">A: sorted array / O(log n).</w:t>
+      </w:r>
+    </w:p>
+    <w:bookmarkEnd w:id="155"/>
+    <w:bookmarkStart w:id="156" w:name="Xa101d7702d56133f43747c31ff82170f254aa37"/>
+    <w:p>
+      <w:pPr>
+        <w:pStyle w:val="Heading2"/>
+      </w:pPr>
+      <w:r>
+        <w:t xml:space="preserve">Module 2 — Pattern Recognition (how to spot it in an interview)</w:t>
+      </w:r>
+    </w:p>
+    <w:p>
+      <w:pPr>
+        <w:pStyle w:val="Compact"/>
+        <w:numPr>
+          <w:ilvl w:val="0"/>
+          <w:numId w:val="1052"/>
+        </w:numPr>
+      </w:pPr>
+      <w:r>
+        <w:t xml:space="preserve">“Range sum / many queries”</w:t>
+      </w:r>
+      <w:r>
+        <w:t xml:space="preserve"> </w:t>
+      </w:r>
+      <w:r>
+        <w:t xml:space="preserve">→</w:t>
+      </w:r>
+      <w:r>
+        <w:t xml:space="preserve"> </w:t>
+      </w:r>
+      <w:r>
+        <w:rPr>
+          <w:b/>
+          <w:bCs/>
+        </w:rPr>
+        <w:t xml:space="preserve">prefix sum</w:t>
+      </w:r>
+      <w:r>
+        <w:t xml:space="preserve">.</w:t>
+      </w:r>
+    </w:p>
+    <w:p>
+      <w:pPr>
+        <w:pStyle w:val="Compact"/>
+        <w:numPr>
+          <w:ilvl w:val="0"/>
+          <w:numId w:val="1052"/>
+        </w:numPr>
+      </w:pPr>
+      <w:r>
+        <w:t xml:space="preserve">“Range update many times”</w:t>
+      </w:r>
+      <w:r>
+        <w:t xml:space="preserve"> </w:t>
+      </w:r>
+      <w:r>
+        <w:t xml:space="preserve">→</w:t>
+      </w:r>
+      <w:r>
+        <w:t xml:space="preserve"> </w:t>
+      </w:r>
+      <w:r>
+        <w:rPr>
+          <w:b/>
+          <w:bCs/>
+        </w:rPr>
+        <w:t xml:space="preserve">difference array</w:t>
+      </w:r>
+      <w:r>
+        <w:t xml:space="preserve">.</w:t>
+      </w:r>
+    </w:p>
+    <w:p>
+      <w:pPr>
+        <w:pStyle w:val="Compact"/>
+        <w:numPr>
+          <w:ilvl w:val="0"/>
+          <w:numId w:val="1052"/>
+        </w:numPr>
+      </w:pPr>
+      <w:r>
+        <w:t xml:space="preserve">“Sorted array + pair/triplet”</w:t>
+      </w:r>
+      <w:r>
+        <w:t xml:space="preserve"> </w:t>
+      </w:r>
+      <w:r>
+        <w:t xml:space="preserve">→</w:t>
+      </w:r>
+      <w:r>
+        <w:t xml:space="preserve"> </w:t>
+      </w:r>
+      <w:r>
+        <w:rPr>
+          <w:b/>
+          <w:bCs/>
+        </w:rPr>
+        <w:t xml:space="preserve">two pointers</w:t>
+      </w:r>
+      <w:r>
+        <w:t xml:space="preserve">.</w:t>
+      </w:r>
+    </w:p>
+    <w:p>
+      <w:pPr>
+        <w:pStyle w:val="Compact"/>
+        <w:numPr>
+          <w:ilvl w:val="0"/>
+          <w:numId w:val="1052"/>
+        </w:numPr>
+      </w:pPr>
+      <w:r>
+        <w:t xml:space="preserve">“Longest/shortest contiguous subarray/substring with a condition”</w:t>
+      </w:r>
+      <w:r>
+        <w:t xml:space="preserve"> </w:t>
+      </w:r>
+      <w:r>
+        <w:t xml:space="preserve">→</w:t>
+      </w:r>
+      <w:r>
+        <w:t xml:space="preserve"> </w:t>
+      </w:r>
+      <w:r>
+        <w:rPr>
+          <w:b/>
+          <w:bCs/>
+        </w:rPr>
+        <w:t xml:space="preserve">sliding</w:t>
+      </w:r>
+      <w:r>
+        <w:rPr>
+          <w:b/>
+          <w:bCs/>
+        </w:rPr>
+        <w:t xml:space="preserve"> </w:t>
+      </w:r>
+      <w:r>
+        <w:rPr>
+          <w:b/>
+          <w:bCs/>
+        </w:rPr>
+        <w:t xml:space="preserve">window</w:t>
+      </w:r>
+      <w:r>
+        <w:t xml:space="preserve">.</w:t>
+      </w:r>
+    </w:p>
+    <w:p>
+      <w:pPr>
+        <w:pStyle w:val="Compact"/>
+        <w:numPr>
+          <w:ilvl w:val="0"/>
+          <w:numId w:val="1052"/>
+        </w:numPr>
+      </w:pPr>
+      <w:r>
+        <w:t xml:space="preserve">“Max contiguous sum”</w:t>
+      </w:r>
+      <w:r>
+        <w:t xml:space="preserve"> </w:t>
+      </w:r>
+      <w:r>
+        <w:t xml:space="preserve">→</w:t>
+      </w:r>
+      <w:r>
+        <w:t xml:space="preserve"> </w:t>
+      </w:r>
+      <w:r>
+        <w:rPr>
+          <w:b/>
+          <w:bCs/>
+        </w:rPr>
+        <w:t xml:space="preserve">Kadane</w:t>
+      </w:r>
+      <w:r>
+        <w:t xml:space="preserve">.</w:t>
+      </w:r>
+    </w:p>
+    <w:p>
+      <w:pPr>
+        <w:pStyle w:val="Compact"/>
+        <w:numPr>
+          <w:ilvl w:val="0"/>
+          <w:numId w:val="1052"/>
+        </w:numPr>
+      </w:pPr>
+      <w:r>
+        <w:t xml:space="preserve">“Sort into a few categories in place”</w:t>
+      </w:r>
+      <w:r>
+        <w:t xml:space="preserve"> </w:t>
+      </w:r>
+      <w:r>
+        <w:t xml:space="preserve">→</w:t>
+      </w:r>
+      <w:r>
+        <w:t xml:space="preserve"> </w:t>
+      </w:r>
+      <w:r>
+        <w:rPr>
+          <w:b/>
+          <w:bCs/>
+        </w:rPr>
+        <w:t xml:space="preserve">Dutch flag / partition</w:t>
+      </w:r>
+      <w:r>
+        <w:t xml:space="preserve">.</w:t>
+      </w:r>
+    </w:p>
+    <w:p>
+      <w:pPr>
+        <w:pStyle w:val="Compact"/>
+        <w:numPr>
+          <w:ilvl w:val="0"/>
+          <w:numId w:val="1052"/>
+        </w:numPr>
+      </w:pPr>
+      <w:r>
+        <w:t xml:space="preserve">“Subarray sum = k (unsorted)”</w:t>
+      </w:r>
+      <w:r>
+        <w:t xml:space="preserve"> </w:t>
+      </w:r>
+      <w:r>
+        <w:t xml:space="preserve">→</w:t>
+      </w:r>
+      <w:r>
+        <w:t xml:space="preserve"> </w:t>
+      </w:r>
+      <w:r>
+        <w:rPr>
+          <w:b/>
+          <w:bCs/>
+        </w:rPr>
+        <w:t xml:space="preserve">prefix sum + hashmap</w:t>
+      </w:r>
+      <w:r>
+        <w:t xml:space="preserve"> </w:t>
+      </w:r>
+      <w:r>
+        <w:t xml:space="preserve">(Module 7).</w:t>
+      </w:r>
+    </w:p>
+    <w:p>
+      <w:pPr>
+        <w:pStyle w:val="Compact"/>
+        <w:numPr>
+          <w:ilvl w:val="0"/>
+          <w:numId w:val="1052"/>
+        </w:numPr>
+      </w:pPr>
+      <w:r>
+        <w:t xml:space="preserve">“Element appears more than n/2 times”</w:t>
+      </w:r>
+      <w:r>
+        <w:t xml:space="preserve"> </w:t>
+      </w:r>
+      <w:r>
+        <w:t xml:space="preserve">→</w:t>
+      </w:r>
+      <w:r>
+        <w:t xml:space="preserve"> </w:t>
+      </w:r>
+      <w:r>
+        <w:rPr>
+          <w:b/>
+          <w:bCs/>
+        </w:rPr>
+        <w:t xml:space="preserve">Moore’s voting</w:t>
+      </w:r>
+      <w:r>
+        <w:t xml:space="preserve">.</w:t>
+      </w:r>
+    </w:p>
+    <w:p>
+      <w:pPr>
+        <w:pStyle w:val="Compact"/>
+        <w:numPr>
+          <w:ilvl w:val="0"/>
+          <w:numId w:val="1052"/>
+        </w:numPr>
+      </w:pPr>
+      <w:r>
+        <w:t xml:space="preserve">“Overlapping intervals / merge / meeting rooms”</w:t>
+      </w:r>
+      <w:r>
+        <w:t xml:space="preserve"> </w:t>
+      </w:r>
+      <w:r>
+        <w:t xml:space="preserve">→</w:t>
+      </w:r>
+      <w:r>
+        <w:t xml:space="preserve"> </w:t>
+      </w:r>
+      <w:r>
+        <w:rPr>
+          <w:b/>
+          <w:bCs/>
+        </w:rPr>
+        <w:t xml:space="preserve">sort + merge intervals</w:t>
+      </w:r>
+      <w:r>
+        <w:t xml:space="preserve">.</w:t>
+      </w:r>
+    </w:p>
+    <w:p>
+      <w:pPr>
+        <w:pStyle w:val="Compact"/>
+        <w:numPr>
+          <w:ilvl w:val="0"/>
+          <w:numId w:val="1052"/>
+        </w:numPr>
+      </w:pPr>
+      <w:r>
+        <w:t xml:space="preserve">“Array contains 1..n, find missing/duplicate, O(1) space”</w:t>
+      </w:r>
+      <w:r>
+        <w:t xml:space="preserve"> </w:t>
+      </w:r>
+      <w:r>
+        <w:t xml:space="preserve">→</w:t>
+      </w:r>
+      <w:r>
+        <w:t xml:space="preserve"> </w:t>
+      </w:r>
+      <w:r>
+        <w:rPr>
+          <w:b/>
+          <w:bCs/>
+        </w:rPr>
+        <w:t xml:space="preserve">cyclic sort</w:t>
+      </w:r>
+      <w:r>
+        <w:t xml:space="preserve">.</w:t>
+      </w:r>
+    </w:p>
+    <w:p>
+      <w:pPr>
+        <w:pStyle w:val="Compact"/>
+        <w:numPr>
+          <w:ilvl w:val="0"/>
+          <w:numId w:val="1052"/>
+        </w:numPr>
+      </w:pPr>
+      <w:r>
+        <w:t xml:space="preserve">“Rotate the array by k in place”</w:t>
+      </w:r>
+      <w:r>
+        <w:t xml:space="preserve"> </w:t>
+      </w:r>
+      <w:r>
+        <w:t xml:space="preserve">→</w:t>
+      </w:r>
+      <w:r>
+        <w:t xml:space="preserve"> </w:t>
+      </w:r>
+      <w:r>
+        <w:rPr>
+          <w:b/>
+          <w:bCs/>
+        </w:rPr>
+        <w:t xml:space="preserve">three reversals</w:t>
+      </w:r>
+      <w:r>
+        <w:t xml:space="preserve"> </w:t>
+      </w:r>
+      <w:r>
+        <w:t xml:space="preserve">(mind</w:t>
+      </w:r>
+      <w:r>
+        <w:t xml:space="preserve"> </w:t>
+      </w:r>
+      <w:r>
+        <w:rPr>
+          <w:rStyle w:val="VerbatimChar"/>
+        </w:rPr>
+        <w:t xml:space="preserve">k % n</w:t>
+      </w:r>
+      <w:r>
+        <w:t xml:space="preserve">).</w:t>
+      </w:r>
+    </w:p>
+    <w:p>
+      <w:pPr>
+        <w:pStyle w:val="Compact"/>
+        <w:numPr>
+          <w:ilvl w:val="0"/>
+          <w:numId w:val="1052"/>
+        </w:numPr>
+      </w:pPr>
+      <w:r>
+        <w:t xml:space="preserve">“Next bigger arrangement / next permutation”</w:t>
+      </w:r>
+      <w:r>
+        <w:t xml:space="preserve"> </w:t>
+      </w:r>
+      <w:r>
+        <w:t xml:space="preserve">→</w:t>
+      </w:r>
+      <w:r>
+        <w:t xml:space="preserve"> </w:t>
+      </w:r>
+      <w:r>
+        <w:rPr>
+          <w:b/>
+          <w:bCs/>
+        </w:rPr>
+        <w:t xml:space="preserve">find dip, swap, reverse tail</w:t>
+      </w:r>
+      <w:r>
+        <w:t xml:space="preserve">.</w:t>
+      </w:r>
+    </w:p>
+    <w:p>
+      <w:pPr>
+        <w:pStyle w:val="Compact"/>
+        <w:numPr>
+          <w:ilvl w:val="0"/>
+          <w:numId w:val="1052"/>
+        </w:numPr>
+      </w:pPr>
+      <w:r>
+        <w:t xml:space="preserve">“Sorted array + find/lower-bound/</w:t>
+      </w:r>
+      <w:r>
+        <w:t xml:space="preserve">‘search on the answer’</w:t>
+      </w:r>
+      <w:r>
+        <w:t xml:space="preserve">”</w:t>
+      </w:r>
+      <w:r>
+        <w:t xml:space="preserve"> </w:t>
+      </w:r>
+      <w:r>
+        <w:t xml:space="preserve">→</w:t>
+      </w:r>
+      <w:r>
+        <w:t xml:space="preserve"> </w:t>
+      </w:r>
+      <w:r>
+        <w:rPr>
+          <w:b/>
+          <w:bCs/>
+        </w:rPr>
+        <w:t xml:space="preserve">binary search</w:t>
+      </w:r>
+      <w:r>
+        <w:t xml:space="preserve">.</w:t>
+      </w:r>
+    </w:p>
+    <w:p>
+      <w:pPr>
+        <w:pStyle w:val="Compact"/>
+        <w:numPr>
+          <w:ilvl w:val="0"/>
+          <w:numId w:val="1052"/>
+        </w:numPr>
+      </w:pPr>
+      <w:r>
+        <w:t xml:space="preserve">“Contiguous → window/Kadane; non-contiguous (LIS/LCS) → DP”</w:t>
+      </w:r>
+      <w:r>
+        <w:t xml:space="preserve"> </w:t>
+      </w:r>
+      <w:r>
+        <w:t xml:space="preserve">(subarray vs</w:t>
+      </w:r>
+      <w:r>
+        <w:t xml:space="preserve"> </w:t>
+      </w:r>
+      <w:r>
+        <w:t xml:space="preserve">subsequence).</w:t>
+      </w:r>
+    </w:p>
+    <w:bookmarkEnd w:id="156"/>
+    <w:bookmarkStart w:id="157" w:name="Xe3b5cc6846e3573366b27203e9fc801d53a8909"/>
+    <w:p>
+      <w:pPr>
+        <w:pStyle w:val="Heading2"/>
+      </w:pPr>
+      <w:r>
+        <w:t xml:space="preserve">Module 2 — Interview Questions (with follow-ups)</w:t>
+      </w:r>
+    </w:p>
+    <w:p>
+      <w:pPr>
+        <w:pStyle w:val="Compact"/>
+        <w:numPr>
+          <w:ilvl w:val="0"/>
+          <w:numId w:val="1053"/>
+        </w:numPr>
       </w:pPr>
       <w:r>
         <w:rPr>
           <w:i/>
           <w:iCs/>
         </w:rPr>
-        <w:t xml:space="preserve">End of Module 2. Next: Module 3 — Strings (hashing, KMP, Z-algorithm, Rabin-</w:t>
+        <w:t xml:space="preserve">How is dynamic-array append O(1)?</w:t>
+      </w:r>
+      <w:r>
+        <w:t xml:space="preserve"> </w:t>
+      </w:r>
+      <w:r>
+        <w:t xml:space="preserve">FU:</w:t>
+      </w:r>
+      <w:r>
+        <w:t xml:space="preserve"> </w:t>
       </w:r>
       <w:r>
         <w:rPr>
           <w:i/>
           <w:iCs/>
         </w:rPr>
-        <w:t xml:space="preserve"> </w:t>
-      </w:r>
+        <w:t xml:space="preserve">what about +1 growth?</w:t>
+      </w:r>
+      <w:r>
+        <w:t xml:space="preserve"> </w:t>
+      </w:r>
+      <w:r>
+        <w:t xml:space="preserve">→ O(n²).</w:t>
+      </w:r>
+    </w:p>
+    <w:p>
+      <w:pPr>
+        <w:pStyle w:val="Compact"/>
+        <w:numPr>
+          <w:ilvl w:val="0"/>
+          <w:numId w:val="1053"/>
+        </w:numPr>
+      </w:pPr>
       <w:r>
         <w:rPr>
           <w:i/>
           <w:iCs/>
         </w:rPr>
+        <w:t xml:space="preserve">Make range sum O(1).</w:t>
+      </w:r>
+      <w:r>
+        <w:t xml:space="preserve"> </w:t>
+      </w:r>
+      <w:r>
+        <w:t xml:space="preserve">FU:</w:t>
+      </w:r>
+      <w:r>
+        <w:t xml:space="preserve"> </w:t>
+      </w:r>
+      <w:r>
+        <w:rPr>
+          <w:i/>
+          <w:iCs/>
+        </w:rPr>
+        <w:t xml:space="preserve">for 2D?</w:t>
+      </w:r>
+      <w:r>
+        <w:t xml:space="preserve"> </w:t>
+      </w:r>
+      <w:r>
+        <w:t xml:space="preserve">→ inclusion-exclusion.</w:t>
+      </w:r>
+    </w:p>
+    <w:p>
+      <w:pPr>
+        <w:pStyle w:val="Compact"/>
+        <w:numPr>
+          <w:ilvl w:val="0"/>
+          <w:numId w:val="1053"/>
+        </w:numPr>
+      </w:pPr>
+      <w:r>
+        <w:rPr>
+          <w:i/>
+          <w:iCs/>
+        </w:rPr>
+        <w:t xml:space="preserve">Solve 3Sum.</w:t>
+      </w:r>
+      <w:r>
+        <w:t xml:space="preserve"> </w:t>
+      </w:r>
+      <w:r>
+        <w:t xml:space="preserve">FU:</w:t>
+      </w:r>
+      <w:r>
+        <w:t xml:space="preserve"> </w:t>
+      </w:r>
+      <w:r>
+        <w:rPr>
+          <w:i/>
+          <w:iCs/>
+        </w:rPr>
+        <w:t xml:space="preserve">handle duplicates; complexity?</w:t>
+      </w:r>
+      <w:r>
+        <w:t xml:space="preserve"> </w:t>
+      </w:r>
+      <w:r>
+        <w:t xml:space="preserve">→ O(n²).</w:t>
+      </w:r>
+    </w:p>
+    <w:p>
+      <w:pPr>
+        <w:pStyle w:val="Compact"/>
+        <w:numPr>
+          <w:ilvl w:val="0"/>
+          <w:numId w:val="1053"/>
+        </w:numPr>
+      </w:pPr>
+      <w:r>
+        <w:rPr>
+          <w:i/>
+          <w:iCs/>
+        </w:rPr>
+        <w:t xml:space="preserve">Longest substring without repeats.</w:t>
+      </w:r>
+      <w:r>
+        <w:t xml:space="preserve"> </w:t>
+      </w:r>
+      <w:r>
+        <w:t xml:space="preserve">FU:</w:t>
+      </w:r>
+      <w:r>
+        <w:t xml:space="preserve"> </w:t>
+      </w:r>
+      <w:r>
+        <w:rPr>
+          <w:i/>
+          <w:iCs/>
+        </w:rPr>
+        <w:t xml:space="preserve">prove it is O(n).</w:t>
+      </w:r>
+    </w:p>
+    <w:p>
+      <w:pPr>
+        <w:pStyle w:val="Compact"/>
+        <w:numPr>
+          <w:ilvl w:val="0"/>
+          <w:numId w:val="1053"/>
+        </w:numPr>
+      </w:pPr>
+      <w:r>
+        <w:rPr>
+          <w:i/>
+          <w:iCs/>
+        </w:rPr>
+        <w:t xml:space="preserve">Sort colors in one pass.</w:t>
+      </w:r>
+      <w:r>
+        <w:t xml:space="preserve"> </w:t>
+      </w:r>
+      <w:r>
+        <w:t xml:space="preserve">FU:</w:t>
+      </w:r>
+      <w:r>
+        <w:t xml:space="preserve"> </w:t>
+      </w:r>
+      <w:r>
+        <w:rPr>
+          <w:i/>
+          <w:iCs/>
+        </w:rPr>
+        <w:t xml:space="preserve">does it generalise to 4 colors?</w:t>
+      </w:r>
+    </w:p>
+    <w:p>
+      <w:pPr>
+        <w:pStyle w:val="Compact"/>
+        <w:numPr>
+          <w:ilvl w:val="0"/>
+          <w:numId w:val="1053"/>
+        </w:numPr>
+      </w:pPr>
+      <w:r>
+        <w:rPr>
+          <w:i/>
+          <w:iCs/>
+        </w:rPr>
+        <w:t xml:space="preserve">Max subarray; the all-negative case?</w:t>
+      </w:r>
+      <w:r>
+        <w:t xml:space="preserve"> </w:t>
+      </w:r>
+      <w:r>
+        <w:t xml:space="preserve">FU:</w:t>
+      </w:r>
+      <w:r>
+        <w:t xml:space="preserve"> </w:t>
+      </w:r>
+      <w:r>
+        <w:rPr>
+          <w:i/>
+          <w:iCs/>
+        </w:rPr>
+        <w:t xml:space="preserve">also return the indices.</w:t>
+      </w:r>
+    </w:p>
+    <w:p>
+      <w:pPr>
+        <w:pStyle w:val="Compact"/>
+        <w:numPr>
+          <w:ilvl w:val="0"/>
+          <w:numId w:val="1053"/>
+        </w:numPr>
+      </w:pPr>
+      <w:r>
+        <w:rPr>
+          <w:i/>
+          <w:iCs/>
+        </w:rPr>
+        <w:t xml:space="preserve">Rotate an array by k in O(1) space.</w:t>
+      </w:r>
+      <w:r>
+        <w:t xml:space="preserve"> </w:t>
+      </w:r>
+      <w:r>
+        <w:t xml:space="preserve">FU:</w:t>
+      </w:r>
+      <w:r>
+        <w:t xml:space="preserve"> </w:t>
+      </w:r>
+      <w:r>
+        <w:rPr>
+          <w:i/>
+          <w:iCs/>
+        </w:rPr>
+        <w:t xml:space="preserve">why three reversals? what if k&gt;n?</w:t>
+      </w:r>
+    </w:p>
+    <w:p>
+      <w:pPr>
+        <w:pStyle w:val="Compact"/>
+        <w:numPr>
+          <w:ilvl w:val="0"/>
+          <w:numId w:val="1053"/>
+        </w:numPr>
+      </w:pPr>
+      <w:r>
+        <w:rPr>
+          <w:i/>
+          <w:iCs/>
+        </w:rPr>
+        <w:t xml:space="preserve">Implement next permutation.</w:t>
+      </w:r>
+      <w:r>
+        <w:t xml:space="preserve"> </w:t>
+      </w:r>
+      <w:r>
+        <w:t xml:space="preserve">FU:</w:t>
+      </w:r>
+      <w:r>
+        <w:t xml:space="preserve"> </w:t>
+      </w:r>
+      <w:r>
+        <w:rPr>
+          <w:i/>
+          <w:iCs/>
+        </w:rPr>
+        <w:t xml:space="preserve">what if the array is fully descending?</w:t>
+      </w:r>
+    </w:p>
+    <w:p>
+      <w:pPr>
+        <w:pStyle w:val="Compact"/>
+        <w:numPr>
+          <w:ilvl w:val="0"/>
+          <w:numId w:val="1053"/>
+        </w:numPr>
+      </w:pPr>
+      <w:r>
+        <w:rPr>
+          <w:i/>
+          <w:iCs/>
+        </w:rPr>
+        <w:t xml:space="preserve">Binary search variants.</w:t>
+      </w:r>
+      <w:r>
+        <w:t xml:space="preserve"> </w:t>
+      </w:r>
+      <w:r>
+        <w:t xml:space="preserve">FU:</w:t>
+      </w:r>
+      <w:r>
+        <w:t xml:space="preserve"> </w:t>
+      </w:r>
+      <w:r>
+        <w:rPr>
+          <w:i/>
+          <w:iCs/>
+        </w:rPr>
+        <w:t xml:space="preserve">find the first index ≥ target (lower bound).</w:t>
+      </w:r>
+    </w:p>
+    <w:bookmarkEnd w:id="157"/>
+    <w:bookmarkStart w:id="158" w:name="module-2-gate-sebi-rbi-isro-perspective"/>
+    <w:p>
+      <w:pPr>
+        <w:pStyle w:val="Heading2"/>
+      </w:pPr>
+      <w:r>
+        <w:t xml:space="preserve">Module 2 — GATE / SEBI / RBI / ISRO Perspective</w:t>
+      </w:r>
+    </w:p>
+    <w:p>
+      <w:pPr>
+        <w:pStyle w:val="Compact"/>
+        <w:numPr>
+          <w:ilvl w:val="0"/>
+          <w:numId w:val="1054"/>
+        </w:numPr>
+      </w:pPr>
+      <w:r>
+        <w:rPr>
+          <w:b/>
+          <w:bCs/>
+        </w:rPr>
+        <w:t xml:space="preserve">Common:</w:t>
+      </w:r>
+      <w:r>
+        <w:t xml:space="preserve"> </w:t>
+      </w:r>
+      <w:r>
+        <w:t xml:space="preserve">address calculation (</w:t>
+      </w:r>
+      <w:r>
+        <w:rPr>
+          <w:rStyle w:val="VerbatimChar"/>
+        </w:rPr>
+        <w:t xml:space="preserve">base + i*size</w:t>
+      </w:r>
+      <w:r>
+        <w:t xml:space="preserve">, the 2D row-major formula),</w:t>
+      </w:r>
+      <w:r>
+        <w:t xml:space="preserve"> </w:t>
+      </w:r>
+      <w:r>
+        <w:t xml:space="preserve">amortised analysis of dynamic arrays, time complexity of insert/delete/search,</w:t>
+      </w:r>
+      <w:r>
+        <w:t xml:space="preserve"> </w:t>
+      </w:r>
+      <w:r>
+        <w:t xml:space="preserve">prefix-sum reasoning. The 2D array address formula is a GATE favourite.</w:t>
+      </w:r>
+    </w:p>
+    <w:p>
+      <w:pPr>
+        <w:pStyle w:val="Compact"/>
+        <w:numPr>
+          <w:ilvl w:val="0"/>
+          <w:numId w:val="1054"/>
+        </w:numPr>
+      </w:pPr>
+      <w:r>
+        <w:rPr>
+          <w:b/>
+          <w:bCs/>
+        </w:rPr>
+        <w:t xml:space="preserve">Also seen:</w:t>
+      </w:r>
+      <w:r>
+        <w:t xml:space="preserve"> </w:t>
+      </w:r>
+      <w:r>
+        <w:t xml:space="preserve">binary-search step count (</w:t>
+      </w:r>
+      <w:r>
+        <w:rPr>
+          <w:rStyle w:val="VerbatimChar"/>
+        </w:rPr>
+        <w:t xml:space="preserve">⌈log₂ n⌉</w:t>
+      </w:r>
+      <w:r>
+        <w:t xml:space="preserve"> </w:t>
+      </w:r>
+      <w:r>
+        <w:t xml:space="preserve">comparisons), counting</w:t>
+      </w:r>
+      <w:r>
+        <w:t xml:space="preserve"> </w:t>
+      </w:r>
+      <w:r>
+        <w:t xml:space="preserve">subarrays (</w:t>
+      </w:r>
+      <w:r>
+        <w:rPr>
+          <w:rStyle w:val="VerbatimChar"/>
+        </w:rPr>
+        <w:t xml:space="preserve">n(n+1)/2</w:t>
+      </w:r>
+      <w:r>
+        <w:t xml:space="preserve">), and the number-of-subsequences formula (</w:t>
+      </w:r>
+      <w:r>
+        <w:rPr>
+          <w:rStyle w:val="VerbatimChar"/>
+        </w:rPr>
+        <w:t xml:space="preserve">2ⁿ</w:t>
+      </w:r>
+      <w:r>
+        <w:t xml:space="preserve">).</w:t>
+      </w:r>
+    </w:p>
+    <w:p>
+      <w:r>
+        <w:pict>
+          <v:rect style="width:0;height:1.5pt" o:hralign="center" o:hrstd="t" o:hr="t"/>
+        </w:pict>
+      </w:r>
+    </w:p>
+    <w:p>
+      <w:pPr>
+        <w:pStyle w:val="FirstParagraph"/>
+      </w:pPr>
+      <w:r>
+        <w:rPr>
+          <w:i/>
+          <w:iCs/>
+        </w:rPr>
+        <w:t xml:space="preserve">End of Module 2. Next: Module 3 — Strings (hashing, KMP, Z-algorithm, Rabin-</w:t>
+      </w:r>
+      <w:r>
+        <w:rPr>
+          <w:i/>
+          <w:iCs/>
+        </w:rPr>
+        <w:t xml:space="preserve"> </w:t>
+      </w:r>
+      <w:r>
+        <w:rPr>
+          <w:i/>
+          <w:iCs/>
+        </w:rPr>
         <w:t xml:space="preserve">Karp, Trie basics) — with visuals.</w:t>
       </w:r>
     </w:p>
-    <w:bookmarkEnd w:id="149"/>
-    <w:bookmarkEnd w:id="150"/>
+    <w:bookmarkEnd w:id="158"/>
+    <w:bookmarkEnd w:id="159"/>
     <w:sectPr>
       <w:footnotePr>
         <w:numRestart w:val="eachSect"/>
@@ -12959,6 +15352,9 @@
     <w:abstractNumId w:val="991"/>
   </w:num>
   <w:num w:numId="1048">
+    <w:abstractNumId w:val="991"/>
+  </w:num>
+  <w:num w:numId="1049">
     <w:abstractNumId w:val="99411"/>
     <w:lvlOverride w:ilvl="0">
       <w:startOverride w:val="1"/>
@@ -12988,7 +15384,46 @@
       <w:startOverride w:val="1"/>
     </w:lvlOverride>
   </w:num>
-  <w:num w:numId="1049">
+  <w:num w:numId="1050">
+    <w:abstractNumId w:val="991"/>
+  </w:num>
+  <w:num w:numId="1051">
+    <w:abstractNumId w:val="991"/>
+  </w:num>
+  <w:num w:numId="1052">
+    <w:abstractNumId w:val="991"/>
+  </w:num>
+  <w:num w:numId="1053">
+    <w:abstractNumId w:val="99411"/>
+    <w:lvlOverride w:ilvl="0">
+      <w:startOverride w:val="1"/>
+    </w:lvlOverride>
+    <w:lvlOverride w:ilvl="1">
+      <w:startOverride w:val="1"/>
+    </w:lvlOverride>
+    <w:lvlOverride w:ilvl="2">
+      <w:startOverride w:val="1"/>
+    </w:lvlOverride>
+    <w:lvlOverride w:ilvl="3">
+      <w:startOverride w:val="1"/>
+    </w:lvlOverride>
+    <w:lvlOverride w:ilvl="4">
+      <w:startOverride w:val="1"/>
+    </w:lvlOverride>
+    <w:lvlOverride w:ilvl="5">
+      <w:startOverride w:val="1"/>
+    </w:lvlOverride>
+    <w:lvlOverride w:ilvl="6">
+      <w:startOverride w:val="1"/>
+    </w:lvlOverride>
+    <w:lvlOverride w:ilvl="7">
+      <w:startOverride w:val="1"/>
+    </w:lvlOverride>
+    <w:lvlOverride w:ilvl="8">
+      <w:startOverride w:val="1"/>
+    </w:lvlOverride>
+  </w:num>
+  <w:num w:numId="1054">
     <w:abstractNumId w:val="991"/>
   </w:num>
 </w:numbering>

</xml_diff>